<commit_message>
Investigation Plan: the Assessment section is asked for, checked, and scored
The template already had an Assessment section — what you will look for in
the work — but the assignment never mentioned it, the rubric did not score
it, and neither the peer reviewer nor Alkimi was asked to check it. It was the
one section a student could leave thin for free. It is now a Studio step
(Name your read), an aim-for bullet, part of the After criterion, a
peer-review question, and a line in the Alkimi prompt. It also names the DOK
the task asks for, which is how the Final Report reads every artifact.

Co-Authored-By: Claude Opus 5 (1M context) <noreply@anthropic.com>
</commit_message>
<xml_diff>
--- a/week-10-investigation-plan/week-10-investigation-plan.docx
+++ b/week-10-investigation-plan/week-10-investigation-plan.docx
@@ -348,6 +348,36 @@
     </w:p>
     <w:p>
       <w:pPr>
+        <w:pStyle w:val="ListBullet"/>
+        <w:spacing w:before="0" w:after="100" w:line="276" w:lineRule="auto"/>
+        <w:ind w:left="360" w:hanging="360"/>
+        <w:jc w:val="start"/>
+      </w:pPr>
+      <w:r>
+        <w:rPr>
+          <w:rFonts w:ascii="Calibri" w:hAnsi="Calibri" w:eastAsia="ＭＳ 明朝" w:cs="Calibri"/>
+          <w:b/>
+          <w:bCs/>
+          <w:color w:val="1F2933"/>
+          <w:kern w:val="0"/>
+          <w:sz w:val="22"/>
+          <w:szCs w:val="22"/>
+        </w:rPr>
+        <w:t>A read you can name.</w:t>
+      </w:r>
+      <w:r>
+        <w:rPr>
+          <w:rFonts w:ascii="Calibri" w:hAnsi="Calibri" w:eastAsia="ＭＳ 明朝" w:cs="Calibri"/>
+          <w:color w:val="1F2933"/>
+          <w:kern w:val="0"/>
+          <w:sz w:val="22"/>
+          <w:szCs w:val="22"/>
+        </w:rPr>
+        <w:t xml:space="preserve"> Before you teach, you can say what you will look for in the work you collect, and what would not count as evidence.</w:t>
+      </w:r>
+    </w:p>
+    <w:p>
+      <w:pPr>
         <w:spacing w:before="0" w:after="160" w:line="276" w:lineRule="auto"/>
         <w:jc w:val="start"/>
       </w:pPr>
@@ -442,6 +472,36 @@
           <w:szCs w:val="22"/>
         </w:rPr>
         <w:t xml:space="preserve"> Decide the artifact you will collect (an exit slip, a jot-your-reasoning prompt, a photo of the work) and one or two questions that push the reasoning. The capture is required.</w:t>
+      </w:r>
+    </w:p>
+    <w:p>
+      <w:pPr>
+        <w:pStyle w:val="ListNumber"/>
+        <w:spacing w:before="0" w:after="100" w:line="276" w:lineRule="auto"/>
+        <w:ind w:left="360" w:hanging="360"/>
+        <w:jc w:val="start"/>
+      </w:pPr>
+      <w:r>
+        <w:rPr>
+          <w:rFonts w:ascii="Calibri" w:hAnsi="Calibri" w:eastAsia="ＭＳ 明朝" w:cs="Calibri"/>
+          <w:b/>
+          <w:bCs/>
+          <w:color w:val="1F2933"/>
+          <w:kern w:val="0"/>
+          <w:sz w:val="22"/>
+          <w:szCs w:val="22"/>
+        </w:rPr>
+        <w:t>Name your read.</w:t>
+      </w:r>
+      <w:r>
+        <w:rPr>
+          <w:rFonts w:ascii="Calibri" w:hAnsi="Calibri" w:eastAsia="ＭＳ 明朝" w:cs="Calibri"/>
+          <w:color w:val="1F2933"/>
+          <w:kern w:val="0"/>
+          <w:sz w:val="22"/>
+          <w:szCs w:val="22"/>
+        </w:rPr>
+        <w:t xml:space="preserve"> Fill in the Assessment section of the plan. Say what you will look for in the work students produce on the task and on the After. Which strategies, representations, or explanations would count as evidence that a student understands the concept? Which would not? Name the Depth of Knowledge the task asks for, too. In Week 5 you scored the same student work with several rubrics and saw how much the choice of rubric mattered. Here you choose your own. Whatever you write in this section is what you will use to read your data for the Final Report.</w:t>
       </w:r>
     </w:p>
     <w:p>
@@ -1092,7 +1152,7 @@
                 <w:sz w:val="22"/>
                 <w:szCs w:val="22"/>
               </w:rPr>
-              <w:t>The After collects an artifact you could genuinely study in relation to your question, not a quick right-or-wrong check.</w:t>
+              <w:t>The After collects an artifact you could genuinely study in relation to your question, not a quick right-or-wrong check, and the Assessment section says what you will look for in it.</w:t>
             </w:r>
           </w:p>
         </w:tc>
@@ -1400,7 +1460,7 @@
           <w:sz w:val="22"/>
           <w:szCs w:val="22"/>
         </w:rPr>
-        <w:t>2. The After is where I capture evidence. Would what I collect there be something I could study in relation to my question, or is it too thin?</w:t>
+        <w:t>2. The After is where I capture evidence. Would what I collect there be something I could study in relation to my question, or is it too thin? Have I said what I would look for in it?</w:t>
       </w:r>
     </w:p>
     <w:p>

</xml_diff>

<commit_message>
Week 10 assignment: Check this on all three panes; the prompt becomes a description
Six mentions plus two of "genAI partner", including the rubric row that grades Document 2
("the genAI audit" → "the planning partner's audit").

The prompt section is rewritten rather than deleted, same as Weeks 8 and 9: the five
questions are what the rubric grades, so they stay. They also change person — "Read the
whole plan against MY question... would students' responses give ME insight" was written
by a student to a chatbot. Addressed now to the student, since the Planner asks them.

"My research question is: [state it]" is gone. The Planner has the question.

Pre-existing and NOT introduced here: the file fails one ID constraint
(w14:paraId=DD9FCF55 >= 0x80000000). The untouched original fails identically. Word
tolerates it and fixing it would churn paragraph IDs for nothing.

59 paragraphs unchanged, 4 pages before and after.

Co-Authored-By: Claude Opus 5 (1M context) <noreply@anthropic.com>
</commit_message>
<xml_diff>
--- a/week-10-investigation-plan/week-10-investigation-plan.docx
+++ b/week-10-investigation-plan/week-10-investigation-plan.docx
@@ -600,7 +600,7 @@
           <w:sz w:val="22"/>
           <w:szCs w:val="22"/>
         </w:rPr>
-        <w:t>Then take your whole plan and your question to Alkimi,</w:t>
+        <w:t>Then press Check this on each of the three panes in the BDA Planner — Before, During, After —</w:t>
       </w:r>
       <w:r>
         <w:rPr>
@@ -760,7 +760,7 @@
           <w:sz w:val="22"/>
           <w:szCs w:val="22"/>
         </w:rPr>
-        <w:t xml:space="preserve"> how you used the feedback, one to two paragraphs. Your plan went through two reads, a classmate and a genAI partner. Tell us how you used them: which feedback did you act on, which did you set aside, and why? What surprised you? The plan is yours. We are assessing the judgment you brought to the critiques, not proof that you received them.</w:t>
+        <w:t xml:space="preserve"> how you used the feedback, one to two paragraphs. Your plan went through two reads, a classmate and the planning partner. Tell us how you used them: which feedback did you act on, which did you set aside, and why? What surprised you? The plan is yours. We are assessing the judgment you brought to the critiques, not proof that you received them.</w:t>
       </w:r>
     </w:p>
     <w:p>
@@ -866,7 +866,7 @@
           <w:sz w:val="22"/>
           <w:szCs w:val="22"/>
         </w:rPr>
-        <w:t>Human first: your classmate reviews your plan before Alkimi does. You bring what you learn from that review to Alkimi, not the other way around. Both read your design. Neither one makes it for you.</w:t>
+        <w:t>Human first: your classmate reviews your plan before the planning partner does. You bring what you learn from that review to the Planner, not the other way around. Both read your design. Neither one makes it for you.</w:t>
       </w:r>
     </w:p>
     <w:p>
@@ -887,7 +887,7 @@
           <w:sz w:val="22"/>
           <w:szCs w:val="22"/>
         </w:rPr>
-        <w:t>Alkimi is a critic: it pressure-tests whether the whole plan gives you insight into your question and whether the After captures real evidence. It does not design the lesson for you. The design judgment is yours.</w:t>
+        <w:t>The planning partner is a critic: it pressure-tests whether the whole plan gives you insight into your question and whether the After captures real evidence. It does not design the lesson for you. The design judgment is yours.</w:t>
       </w:r>
     </w:p>
     <w:p>
@@ -1362,7 +1362,7 @@
                 <w:sz w:val="22"/>
                 <w:szCs w:val="22"/>
               </w:rPr>
-              <w:t>Document 2 reasons clearly about how the classmate’s review and the genAI audit shaped the final plan: what was used, what was set aside, and why.</w:t>
+              <w:t>Document 2 reasons clearly about how the classmate’s review and the planning partner’s audit shaped the final plan: what was used, what was set aside, and why.</w:t>
             </w:r>
           </w:p>
         </w:tc>
@@ -1394,7 +1394,7 @@
           <w:sz w:val="24"/>
           <w:szCs w:val="24"/>
         </w:rPr>
-        <w:t>The Prompt to Give Alkimi</w:t>
+        <w:t>What the Planning Partner Checks</w:t>
       </w:r>
     </w:p>
     <w:p>
@@ -1410,7 +1410,7 @@
           <w:sz w:val="22"/>
           <w:szCs w:val="22"/>
         </w:rPr>
-        <w:t>Paste your whole Investigation Plan and your research question. Then give Alkimi this prompt:</w:t>
+        <w:t>Press Check this on each pane. Nothing to paste — the Planner holds your whole plan and your question. It does this with them:</w:t>
       </w:r>
     </w:p>
     <w:p>
@@ -1426,7 +1426,7 @@
           <w:sz w:val="22"/>
           <w:szCs w:val="22"/>
         </w:rPr>
-        <w:t>You are a critical friend helping me check a lesson I designed to investigate a research question about how students understand a mathematical concept. Do not redesign it. Test the one I give you. My research question is: [state it]. The lesson has three parts: a Before (a warm-up routine), a During (a rich task), and an After (how I capture students’ thinking). Answer plainly and honestly:</w:t>
+        <w:t>It acts as a critical friend checking a lesson designed to investigate a research question about how students understand a mathematical concept. It will not redesign it — it tests the one you built, against the question you wrote in the Planner, across its three parts: the Before (a warm-up routine), the During (a rich task), and the After (how you capture students’ thinking). It answers plainly:</w:t>
       </w:r>
     </w:p>
     <w:p>
@@ -1443,7 +1443,7 @@
           <w:sz w:val="22"/>
           <w:szCs w:val="22"/>
         </w:rPr>
-        <w:t>1. Read the whole plan against my question. If I taught this, would students’ responses give me insight into it? Where would it, and where would it fall short?</w:t>
+        <w:t>1. Reading the whole plan against your question: if you taught this, would students’ responses give you insight into it? Where would it, and where would it fall short?</w:t>
       </w:r>
     </w:p>
     <w:p>
@@ -1460,7 +1460,7 @@
           <w:sz w:val="22"/>
           <w:szCs w:val="22"/>
         </w:rPr>
-        <w:t>2. The After is where I capture evidence. Would what I collect there be something I could study in relation to my question, or is it too thin? Have I said what I would look for in it?</w:t>
+        <w:t>2. The After is where you capture evidence. Would what you collect there be something you could study in relation to your question, or is it too thin? Have you said what you would look for in it?</w:t>
       </w:r>
     </w:p>
     <w:p>
@@ -1511,7 +1511,7 @@
           <w:sz w:val="22"/>
           <w:szCs w:val="22"/>
         </w:rPr>
-        <w:t>5. What one or two changes would make this a sharper instrument for my question?</w:t>
+        <w:t>5. What one or two changes would make this a sharper instrument for your question?</w:t>
       </w:r>
     </w:p>
     <w:p>
@@ -1527,7 +1527,7 @@
           <w:sz w:val="22"/>
           <w:szCs w:val="22"/>
         </w:rPr>
-        <w:t>If the plan would give me little insight into my question, say so plainly.</w:t>
+        <w:t>If the plan would give you little insight into your question, it will say so plainly.</w:t>
       </w:r>
     </w:p>
     <w:sectPr>

</xml_diff>

<commit_message>
The assignment documents say "BDA Planner" and "Lesson Planner" too
The pages were renamed in b7a3521; the .docx assignments weren't, so
they disagreed with what students read beside them.

Seven app mentions that had dropped to bare "Planner" — wk10 (3), wk9
(2), wk8, wk7 — now say "BDA Planner". wk8 and wk9 each introduced it
in full and then shortened it a few lines later.

Two role mentions follow the pages: the wk4 reading-homework header is
"Week 4 · Lesson Planner", and the wk6 concept profile lists "learner,
listener, poser, lesson planner, assessor".

"planning partner" and "Field Prep Partner" are untouched — different
things, not short forms of the app.

Co-Authored-By: Claude Opus 5 (1M context) <noreply@anthropic.com>
</commit_message>
<xml_diff>
--- a/week-10-investigation-plan/week-10-investigation-plan.docx
+++ b/week-10-investigation-plan/week-10-investigation-plan.docx
@@ -866,7 +866,7 @@
           <w:sz w:val="22"/>
           <w:szCs w:val="22"/>
         </w:rPr>
-        <w:t>Human first: your classmate reviews your plan before the planning partner does. You bring what you learn from that review to the Planner, not the other way around. Both read your design. Neither one makes it for you.</w:t>
+        <w:t>Human first: your classmate reviews your plan before the planning partner does. You bring what you learn from that review to the BDA Planner, not the other way around. Both read your design. Neither one makes it for you.</w:t>
       </w:r>
     </w:p>
     <w:p>
@@ -1410,7 +1410,7 @@
           <w:sz w:val="22"/>
           <w:szCs w:val="22"/>
         </w:rPr>
-        <w:t>Press Check this on each pane. Nothing to paste — the Planner holds your whole plan and your question. It does this with them:</w:t>
+        <w:t>Press Check this on each pane. Nothing to paste — the BDA Planner holds your whole plan and your question. It does this with them:</w:t>
       </w:r>
     </w:p>
     <w:p>
@@ -1426,7 +1426,7 @@
           <w:sz w:val="22"/>
           <w:szCs w:val="22"/>
         </w:rPr>
-        <w:t>It acts as a critical friend checking a lesson designed to investigate a research question about how students understand a mathematical concept. It will not redesign it — it tests the one you built, against the question you wrote in the Planner, across its three parts: the Before (a warm-up routine), the During (a rich task), and the After (how you capture students’ thinking). It answers plainly:</w:t>
+        <w:t>It acts as a critical friend checking a lesson designed to investigate a research question about how students understand a mathematical concept. It will not redesign it — it tests the one you built, against the question you wrote in the BDA Planner, across its three parts: the Before (a warm-up routine), the During (a rich task), and the After (how you capture students’ thinking). It answers plainly:</w:t>
       </w:r>
     </w:p>
     <w:p>

</xml_diff>

<commit_message>
Week 8: solve rich tasks, find your own; testers by name
Day 1 drops the research-question rework: Bowls on Two Tables (Van de
Walle), How Close to 100? (YouCubed), then an NRICH-first hunt for a
task that fits your question. Day 2 calls them Task Testers, compares
with any source's published solutions, and sets aside time to read the
assignment. Approved sources: NRICH, YouCubed, Van de Walle, JSTOR.
Weeks 9 and 10 name Routine Testers and Plan Testers.

Co-Authored-By: Claude Opus 5.5 <noreply@anthropic.com>
</commit_message>
<xml_diff>
--- a/week-10-investigation-plan/week-10-investigation-plan.docx
+++ b/week-10-investigation-plan/week-10-investigation-plan.docx
@@ -580,7 +580,7 @@
           <w:sz w:val="22"/>
           <w:szCs w:val="22"/>
         </w:rPr>
-        <w:t xml:space="preserve"> with your Field Prep Partner(s), so they know what the plan is trying to find out. Have them read the whole plan and pressure-test it against your question, with the After in focus. Would students’ responses give you insight into your question? Where could a student get through the lesson without revealing their thinking? Is the Before contaminating the During? Capture their feedback.</w:t>
+        <w:t xml:space="preserve"> with your Plan Tester(s), so they know what the plan is trying to find out. Have them read the whole plan and pressure-test it against your question, with the After in focus. Would students’ responses give you insight into your question? Where could a student get through the lesson without revealing their thinking? Is the Before contaminating the During? Capture their feedback.</w:t>
       </w:r>
     </w:p>
     <w:p>
@@ -845,7 +845,7 @@
           <w:sz w:val="22"/>
           <w:szCs w:val="22"/>
         </w:rPr>
-        <w:t>If you have a research partner, the two of you build and defend the plan together. Your Field Prep Partner(s) are different people, the ones who review it, not build it.</w:t>
+        <w:t>If you have a research partner, the two of you build and defend the plan together. Your Plan Tester(s) are different people, the ones who review it, not build it.</w:t>
       </w:r>
     </w:p>
     <w:p>

</xml_diff>

<commit_message>
Week 10: review day in groups of three, then revision day; index follows
Day 1 is the whole-lesson read with the peer-review sheet, then Check this on
all three panes. Day 2 is the assignment, the field-teaching guidelines, and
revision. The Investigation Plan handout now says the After was built in
Week 9 and names the Planner's four kinds of After. The index's Act II
paragraph and the Week 9 and 10 rows match.

Co-Authored-By: Claude Opus 5.5 <noreply@anthropic.com>
</commit_message>
<xml_diff>
--- a/week-10-investigation-plan/week-10-investigation-plan.docx
+++ b/week-10-investigation-plan/week-10-investigation-plan.docx
@@ -87,7 +87,7 @@
           <w:sz w:val="22"/>
           <w:szCs w:val="22"/>
         </w:rPr>
-        <w:t>In Week 7 you wrote a research question about how students understand a particular idea in mathematics. Since then you have built two pieces of a lesson to investigate it: a rich task, the During (Week 8), and a routine, the Before (Week 9). This week you design the last piece, the After, where you capture thinking about the concept, and assemble all three into one Investigation Plan: a single, coherent lesson that is your instrument for gaining insight into your question.</w:t>
+        <w:t>In Week 7 you wrote a research question about how students understand a particular idea in mathematics. Since then you have built the three pieces of a lesson to investigate it: a rich task, the During (Week 8), then a routine, the Before, and the After, where you capture thinking about the concept (Week 9). This week your plan is reviewed as one Investigation Plan, and you revise it: a single, coherent lesson that is your instrument for gaining insight into your question.</w:t>
       </w:r>
     </w:p>
     <w:p>
@@ -207,7 +207,7 @@
           <w:sz w:val="22"/>
           <w:szCs w:val="22"/>
         </w:rPr>
-        <w:t xml:space="preserve"> is the capture. Design a short artifact you can collect, such as an exit slip, a “jot how you know” prompt, or a photo of the work, plus a question or two that pushes the reasoning. The capture is required. Discussion questions are encouraged.</w:t>
+        <w:t xml:space="preserve"> is the capture. Design a short artifact you can collect, such as an exit slip, a discussion transcript, a strategy gallery, or a one-on-one probe, plus a question or two that pushes the reasoning. The capture is required. Discussion questions are encouraged.</w:t>
       </w:r>
     </w:p>
     <w:p>
@@ -423,7 +423,7 @@
           <w:sz w:val="22"/>
           <w:szCs w:val="22"/>
         </w:rPr>
-        <w:t>You assemble your plan in class this week, put it through two reads, and submit the revised version.</w:t>
+        <w:t>Your After comes from Week 9. This week your group and the genAI planning partner review the whole plan, and you revise it before you submit.</w:t>
       </w:r>
     </w:p>
     <w:p>
@@ -441,7 +441,7 @@
           <w:sz w:val="24"/>
           <w:szCs w:val="22"/>
         </w:rPr>
-        <w:t>Studio</w:t>
+        <w:t>Before Day 1</w:t>
       </w:r>
     </w:p>
     <w:p>
@@ -461,7 +461,7 @@
           <w:sz w:val="22"/>
           <w:szCs w:val="22"/>
         </w:rPr>
-        <w:t>Design your After, the capture.</w:t>
+        <w:t>Finish your After, the capture.</w:t>
       </w:r>
       <w:r>
         <w:rPr>
@@ -471,7 +471,7 @@
           <w:sz w:val="22"/>
           <w:szCs w:val="22"/>
         </w:rPr>
-        <w:t xml:space="preserve"> Decide the artifact you will collect (an exit slip, a jot-your-reasoning prompt, a photo of the work) and one or two questions that push the reasoning. The capture is required.</w:t>
+        <w:t xml:space="preserve"> You designed it in Week 9 in the BDA Planner (Plan → After): an exit slip, a discussion transcript, a strategy gallery, or a one-on-one probe, and one or two questions that push the reasoning. The capture is required.</w:t>
       </w:r>
     </w:p>
     <w:p>
@@ -550,7 +550,7 @@
           <w:sz w:val="24"/>
           <w:szCs w:val="22"/>
         </w:rPr>
-        <w:t>Clinic</w:t>
+        <w:t>Day 1: review in groups of three</w:t>
       </w:r>
     </w:p>
     <w:p>
@@ -580,7 +580,7 @@
           <w:sz w:val="22"/>
           <w:szCs w:val="22"/>
         </w:rPr>
-        <w:t xml:space="preserve"> with your Plan Tester(s), so they know what the plan is trying to find out. Have them read the whole plan and pressure-test it against your question, with the After in focus. Would students’ responses give you insight into your question? Where could a student get through the lesson without revealing their thinking? Is the Before contaminating the During? Capture their feedback.</w:t>
+        <w:t xml:space="preserve"> with your group of three, so they know what the plan is trying to find out. Have them read the whole plan and pressure-test it against your question, with the After in focus. Would students’ responses give you insight into your question? Where could a student get through the lesson without revealing their thinking? Is the Before contaminating the During? Capture their feedback.</w:t>
       </w:r>
     </w:p>
     <w:p>
@@ -628,7 +628,7 @@
           <w:sz w:val="24"/>
           <w:szCs w:val="22"/>
         </w:rPr>
-        <w:t>Homework</w:t>
+        <w:t>Day 2: revision</w:t>
       </w:r>
     </w:p>
     <w:p>
@@ -730,7 +730,7 @@
           <w:sz w:val="22"/>
           <w:szCs w:val="22"/>
         </w:rPr>
-        <w:t xml:space="preserve"> your revised Investigation Plan. The completed plan (research question, Before, During, After, and how you will read the evidence), revised in response to your classmate’s review. This is the plan you carry into the field.</w:t>
+        <w:t xml:space="preserve"> your revised Investigation Plan. The completed plan (research question, Before, During, After, and how you will read the evidence), revised in response to your group’s review. This is the plan you carry into the field.</w:t>
       </w:r>
     </w:p>
     <w:p>
@@ -760,7 +760,7 @@
           <w:sz w:val="22"/>
           <w:szCs w:val="22"/>
         </w:rPr>
-        <w:t xml:space="preserve"> how you used the feedback, one to two paragraphs. Your plan went through two reads, a classmate and the genAI planning partner. Tell us how you used them: which feedback did you act on, which did you set aside, and why? What surprised you? The plan is yours. We are assessing the judgment you brought to the critiques, not proof that you received them. Keep this PDF: you read it again in December, when the Final Report asks for a short account of how AI helped you.</w:t>
+        <w:t xml:space="preserve"> how you used the feedback, one to two paragraphs. Your plan went through two reads, your group and the genAI planning partner. Tell us how you used them: which feedback did you act on, which did you set aside, and why? What surprised you? The plan is yours. We are assessing the judgment you brought to the critiques, not proof that you received them. Keep this PDF: you read it again in December, when the Final Report asks for a short account of how AI helped you.</w:t>
       </w:r>
     </w:p>
     <w:p>
@@ -845,7 +845,7 @@
           <w:sz w:val="22"/>
           <w:szCs w:val="22"/>
         </w:rPr>
-        <w:t>Your Plan Tester(s) review your plan; they don't help build it.</w:t>
+        <w:t>Your group reviews your plan; they don't help build it.</w:t>
       </w:r>
     </w:p>
     <w:p>
@@ -866,7 +866,7 @@
           <w:sz w:val="22"/>
           <w:szCs w:val="22"/>
         </w:rPr>
-        <w:t>Human first: your classmate reviews your plan before the genAI planning partner does. You bring what you learn from that review to the BDA Planner, not the other way around. Both read your design. Neither one makes it for you.</w:t>
+        <w:t>Human first: your group reviews your plan before the genAI planning partner does. You bring what you learn from that review to the BDA Planner, not the other way around. Both read your design. Neither one makes it for you.</w:t>
       </w:r>
     </w:p>
     <w:p>
@@ -1362,7 +1362,7 @@
                 <w:sz w:val="22"/>
                 <w:szCs w:val="22"/>
               </w:rPr>
-              <w:t>Document 2 reasons clearly about how the classmate’s review and the genAI planning partner’s audit shaped the final plan: what was used, what was set aside, and why.</w:t>
+              <w:t>Document 2 reasons clearly about how the group’s review and the genAI planning partner’s audit shaped the final plan: what was used, what was set aside, and why.</w:t>
             </w:r>
           </w:p>
         </w:tc>

</xml_diff>

<commit_message>
Week 10: accept the Investigation Plan as Word or PDF
Co-Authored-By: Claude Opus 5.5 <noreply@anthropic.com>
</commit_message>
<xml_diff>
--- a/week-10-investigation-plan/week-10-investigation-plan.docx
+++ b/week-10-investigation-plan/week-10-investigation-plan.docx
@@ -700,7 +700,7 @@
           <w:sz w:val="22"/>
           <w:szCs w:val="22"/>
         </w:rPr>
-        <w:t>Two documents, submitted in Canvas as a single (combined) PDF or two separate PDFs:</w:t>
+        <w:t>Two documents, submitted in Canvas as Word (.docx) or PDF, in one file or two:</w:t>
       </w:r>
     </w:p>
     <w:p>
@@ -760,7 +760,7 @@
           <w:sz w:val="22"/>
           <w:szCs w:val="22"/>
         </w:rPr>
-        <w:t xml:space="preserve"> how you used the feedback, one to two paragraphs. Your plan went through two reads, your group and the genAI planning partner. Tell us how you used them: which feedback did you act on, which did you set aside, and why? What surprised you? The plan is yours. We are assessing the judgment you brought to the critiques, not proof that you received them. Keep this PDF: you read it again in December, when the Final Report asks for a short account of how AI helped you.</w:t>
+        <w:t xml:space="preserve"> how you used the feedback, one to two paragraphs. Your plan went through two reads, your group and the genAI planning partner. Tell us how you used them: which feedback did you act on, which did you set aside, and why? What surprised you? The plan is yours. We are assessing the judgment you brought to the critiques, not proof that you received them. Keep this document: you read it again in December, when the Final Report asks for a short account of how AI helped you.</w:t>
       </w:r>
     </w:p>
     <w:p>

</xml_diff>

<commit_message>
Investigation Plan is one PDF with the reflection inside
Week 9 day 2 and deck: generate the plan as PDF; the first Check this
saves the After. Week 10 sheet and day 2: one PDF from the Planner,
the reflection is one paragraph on the Share tab, rubric row follows.
Week 5 schedule row updated.

Co-Authored-By: Claude Opus 5.5 <noreply@anthropic.com>
</commit_message>
<xml_diff>
--- a/week-10-investigation-plan/week-10-investigation-plan.docx
+++ b/week-10-investigation-plan/week-10-investigation-plan.docx
@@ -531,7 +531,7 @@
           <w:sz w:val="22"/>
           <w:szCs w:val="22"/>
         </w:rPr>
-        <w:t xml:space="preserve"> In the BDA Planner, go to Share → Document 1 and press Generate Investigation Plan. It lays out everything you've written as the course's 3-Pager. Fill in what is still empty (the goal, standards, anticipated responses, timing) and check the seams: does it read as one lesson, does the Before stay clear of the During’s move, does the After capture what the During surfaces?</w:t>
+        <w:t xml:space="preserve"> In the BDA Planner, go to Share and press Generate Investigation Plan. It lays out everything you've written as the course's 3-Pager. If something is still empty (standards, anticipated responses, timing), write it in the Planner and generate again. Then check the seams: does it read as one lesson, does the Before stay clear of the During’s move, does the After capture what the During surfaces?</w:t>
       </w:r>
     </w:p>
     <w:p>
@@ -656,7 +656,7 @@
           <w:sz w:val="22"/>
           <w:szCs w:val="22"/>
         </w:rPr>
-        <w:t>Submit the revised plan plus a short reflection</w:t>
+        <w:t>Submit the revised plan, with your reflection on the feedback inside it</w:t>
       </w:r>
       <w:r>
         <w:rPr>
@@ -666,7 +666,7 @@
           <w:sz w:val="22"/>
           <w:szCs w:val="22"/>
         </w:rPr>
-        <w:t xml:space="preserve"> on how you used the feedback.</w:t>
+        <w:t xml:space="preserve">.</w:t>
       </w:r>
     </w:p>
     <w:p>
@@ -700,7 +700,7 @@
           <w:sz w:val="22"/>
           <w:szCs w:val="22"/>
         </w:rPr>
-        <w:t>Two documents, submitted in Canvas as Word (.docx) or PDF, in one file or two:</w:t>
+        <w:t>One PDF, submitted in Canvas: the Investigation Plan you generate from the BDA Planner (Share → Generate Investigation Plan). It holds:</w:t>
       </w:r>
     </w:p>
     <w:p>
@@ -720,7 +720,7 @@
           <w:sz w:val="22"/>
           <w:szCs w:val="22"/>
         </w:rPr>
-        <w:t>Document 1:</w:t>
+        <w:t>Your revised plan.</w:t>
       </w:r>
       <w:r>
         <w:rPr>
@@ -730,7 +730,7 @@
           <w:sz w:val="22"/>
           <w:szCs w:val="22"/>
         </w:rPr>
-        <w:t xml:space="preserve"> your revised Investigation Plan. The completed plan (research question, Before, During, After, and how you will read the evidence), revised in response to your group’s review. This is the plan you carry into the field.</w:t>
+        <w:t xml:space="preserve"> The completed plan (research question, Before, During, After, and how you will read the evidence), revised in response to your group’s review. This is the plan you carry into the field.</w:t>
       </w:r>
     </w:p>
     <w:p>
@@ -750,7 +750,7 @@
           <w:sz w:val="22"/>
           <w:szCs w:val="22"/>
         </w:rPr>
-        <w:t>Document 2:</w:t>
+        <w:t>Your reflection on the feedback.</w:t>
       </w:r>
       <w:r>
         <w:rPr>
@@ -760,7 +760,7 @@
           <w:sz w:val="22"/>
           <w:szCs w:val="22"/>
         </w:rPr>
-        <w:t xml:space="preserve"> how you used the feedback, one to two paragraphs. Your plan went through two reads, your group and the genAI planning partner. Tell us how you used them: which feedback did you act on, which did you set aside, and why? What surprised you? The plan is yours. We are assessing the judgment you brought to the critiques, not proof that you received them. Keep this document: you read it again in December, when the Final Report asks for a short account of how AI helped you.</w:t>
+        <w:t xml:space="preserve"> One paragraph, written on the Planner's Share tab. Your After went through two reads, your group and the genAI planning partner. How useful were they as you planned and revised it? Be specific about your After: what changed from your early drafts, what did you set aside, and why? The genAI planning partner's reads print as an appendix. The plan is yours. We are assessing the judgment you brought to the critiques, not proof that you received them. Keep this document: you read it again in December, when the Final Report asks for a short account of how AI helped you.</w:t>
       </w:r>
     </w:p>
     <w:p>
@@ -1362,7 +1362,7 @@
                 <w:sz w:val="22"/>
                 <w:szCs w:val="22"/>
               </w:rPr>
-              <w:t>Document 2 reasons clearly about how the group’s review and the genAI planning partner’s audit shaped the final plan: what was used, what was set aside, and why.</w:t>
+              <w:t>The reflection reasons clearly about how the group’s review and the genAI planning partner’s reads shaped the After: what changed, what was set aside, and why.</w:t>
             </w:r>
           </w:p>
         </w:tc>

</xml_diff>

<commit_message>
Build 79 + Week 10 sheet: group, not classmate; student work, not artifact
- Planner: the reflection asks about your group's feedback (Week 10
  reviews in groups of three), in the Share box, its note, and the plan.
- Week 10 rubric: "collects student work you could study", not "an
  artifact". The sheet's After list says closing discussion, and an exit
  slip asks three or more Student Questions tied to the research question.

Co-Authored-By: Claude Opus 5.5 <noreply@anthropic.com>
</commit_message>
<xml_diff>
--- a/week-10-investigation-plan/week-10-investigation-plan.docx
+++ b/week-10-investigation-plan/week-10-investigation-plan.docx
@@ -207,7 +207,7 @@
           <w:sz w:val="22"/>
           <w:szCs w:val="22"/>
         </w:rPr>
-        <w:t xml:space="preserve"> is the capture. Design a short artifact you can collect, such as an exit slip, a discussion transcript, a strategy gallery, or a one-on-one probe, plus a question or two that pushes the reasoning. The capture is required. Discussion questions are encouraged.</w:t>
+        <w:t xml:space="preserve"> is the capture. Design something short you can collect, such as an exit slip, a closing discussion, a strategy gallery, or a one-on-one probe. An exit slip asks three or more Student Questions, each tied to your research question. The capture is required. Discussion questions are encouraged.</w:t>
       </w:r>
     </w:p>
     <w:p>
@@ -471,7 +471,7 @@
           <w:sz w:val="22"/>
           <w:szCs w:val="22"/>
         </w:rPr>
-        <w:t xml:space="preserve"> You designed it in Week 9 in the BDA Planner (Plan → After): an exit slip, a discussion transcript, a strategy gallery, or a one-on-one probe, and one or two questions that push the reasoning. The capture is required.</w:t>
+        <w:t xml:space="preserve"> You designed it in Week 9 in the BDA Planner (Plan → After): an exit slip, a closing discussion, a strategy gallery, or a one-on-one probe. For an exit slip, that means three or more Student Questions, each with how it helps answer your research question. The capture is required.</w:t>
       </w:r>
     </w:p>
     <w:p>
@@ -1152,7 +1152,7 @@
                 <w:sz w:val="22"/>
                 <w:szCs w:val="22"/>
               </w:rPr>
-              <w:t>The After collects an artifact you could genuinely study in relation to your question, not a quick right-or-wrong check, and the Assessment section says what you will look for in it.</w:t>
+              <w:t>The After collects student work you could genuinely study in relation to your question, not a quick right-or-wrong check, and the Assessment section says what you will look for in it.</w:t>
             </w:r>
           </w:p>
         </w:tc>

</xml_diff>

<commit_message>
Investigation Plan guidelines: one page, built on the BDA Planner's tabs
What's this all about, what do I need to do (one line per Planner tab),
and a rubric by part: Before 5, During 5, After 5, Assessment 3, one
lesson aimed at the question 4, reflection on feedback 3. Due date from
Canvas. The genAI prompt text and the two-document language are gone.

Co-Authored-By: Claude Opus 5.5 <noreply@anthropic.com>
</commit_message>
<xml_diff>
--- a/week-10-investigation-plan/week-10-investigation-plan.docx
+++ b/week-10-investigation-plan/week-10-investigation-plan.docx
@@ -4,1015 +4,359 @@
   <w:body>
     <w:p>
       <w:pPr>
-        <w:spacing w:before="0" w:after="40" w:line="276" w:lineRule="auto"/>
-        <w:jc w:val="start"/>
+        <w:spacing w:after="0" w:before="0" w:line="259" w:lineRule="auto"/>
       </w:pPr>
       <w:r>
         <w:rPr>
-          <w:rFonts w:ascii="Calibri" w:hAnsi="Calibri" w:eastAsia="ＭＳ 明朝" w:cs="Calibri"/>
           <w:b/>
-          <w:bCs/>
+          <w:i w:val="0"/>
           <w:color w:val="1F2933"/>
-          <w:kern w:val="0"/>
-          <w:sz w:val="24"/>
-          <w:szCs w:val="24"/>
+          <w:sz w:val="30"/>
         </w:rPr>
         <w:t>Investigation Plan: The Lesson That Answers Your Question</w:t>
       </w:r>
     </w:p>
     <w:p>
       <w:pPr>
-        <w:spacing w:before="0" w:after="40" w:line="276" w:lineRule="auto"/>
-        <w:jc w:val="start"/>
+        <w:spacing w:after="80" w:before="0" w:line="259" w:lineRule="auto"/>
       </w:pPr>
       <w:r>
         <w:rPr>
-          <w:rFonts w:ascii="Calibri" w:hAnsi="Calibri" w:eastAsia="ＭＳ 明朝" w:cs="Calibri"/>
-          <w:b/>
-          <w:bCs/>
+          <w:b w:val="0"/>
+          <w:i/>
           <w:color w:val="1F2933"/>
-          <w:kern w:val="0"/>
-          <w:sz w:val="24"/>
-          <w:szCs w:val="24"/>
+          <w:sz w:val="20"/>
         </w:rPr>
-        <w:t>Week 10 · TCE 318P FA26 (Edwards)</w:t>
+        <w:t>Week 10 · TCE 318P FA26 (Edwards) · 25 points · due Sunday, November 1, 11:59 pm</w:t>
       </w:r>
     </w:p>
     <w:p>
       <w:pPr>
-        <w:spacing w:before="0" w:after="40" w:line="276" w:lineRule="auto"/>
-        <w:jc w:val="start"/>
+        <w:spacing w:after="40" w:before="140" w:line="259" w:lineRule="auto"/>
       </w:pPr>
       <w:r>
         <w:rPr>
-          <w:rFonts w:ascii="Calibri" w:hAnsi="Calibri" w:eastAsia="ＭＳ 明朝" w:cs="Calibri"/>
           <w:b/>
-          <w:bCs/>
+          <w:i w:val="0"/>
           <w:color w:val="1F2933"/>
-          <w:kern w:val="0"/>
           <w:sz w:val="24"/>
-          <w:szCs w:val="24"/>
-        </w:rPr>
-        <w:t>25 points possible</w:t>
-      </w:r>
-    </w:p>
-    <w:p>
-      <w:pPr>
-        <w:spacing w:before="320" w:after="120" w:line="276" w:lineRule="auto"/>
-        <w:jc w:val="start"/>
-      </w:pPr>
-      <w:r>
-        <w:rPr>
-          <w:rFonts w:ascii="Calibri" w:hAnsi="Calibri" w:eastAsia="ＭＳ 明朝" w:cs="Calibri"/>
-          <w:b/>
-          <w:bCs/>
-          <w:color w:val="0070C0"/>
-          <w:kern w:val="0"/>
-          <w:sz w:val="24"/>
-          <w:szCs w:val="24"/>
         </w:rPr>
         <w:t>1. What’s This All About?</w:t>
       </w:r>
     </w:p>
     <w:p>
       <w:pPr>
-        <w:spacing w:before="0" w:after="160" w:line="276" w:lineRule="auto"/>
-        <w:jc w:val="start"/>
+        <w:spacing w:after="60" w:before="0" w:line="259" w:lineRule="auto"/>
       </w:pPr>
       <w:r>
         <w:rPr>
-          <w:rFonts w:ascii="Calibri" w:hAnsi="Calibri" w:eastAsia="ＭＳ 明朝" w:cs="Calibri"/>
+          <w:b w:val="0"/>
+          <w:i w:val="0"/>
           <w:color w:val="1F2933"/>
-          <w:kern w:val="0"/>
-          <w:sz w:val="22"/>
-          <w:szCs w:val="22"/>
+          <w:sz w:val="21"/>
         </w:rPr>
-        <w:t>In Week 7 you wrote a research question about how students understand a particular idea in mathematics. Since then you have built the three pieces of a lesson to investigate it: a rich task, the During (Week 8), then a routine, the Before, and the After, where you capture thinking about the concept (Week 9). This week your plan is reviewed as one Investigation Plan, and you revise it: a single, coherent lesson that is your instrument for gaining insight into your question.</w:t>
+        <w:t>In Week 7 you wrote a research question about how students understand one idea in mathematics. Since then you have built a lesson to investigate it in the BDA Planner: the During in Week 8, the Before and the After in Week 9. This week you put it together, have it reviewed, revise it, and submit it. Every part earns its place by what it lets you see about how students think. This is the plan you carry into the field in Weeks 11 and 12.</w:t>
       </w:r>
     </w:p>
     <w:p>
       <w:pPr>
-        <w:spacing w:before="0" w:after="160" w:line="276" w:lineRule="auto"/>
-        <w:jc w:val="start"/>
+        <w:spacing w:after="40" w:before="140" w:line="259" w:lineRule="auto"/>
       </w:pPr>
       <w:r>
         <w:rPr>
-          <w:rFonts w:ascii="Calibri" w:hAnsi="Calibri" w:eastAsia="ＭＳ 明朝" w:cs="Calibri"/>
+          <w:b/>
+          <w:i w:val="0"/>
           <w:color w:val="1F2933"/>
-          <w:kern w:val="0"/>
-          <w:sz w:val="22"/>
-          <w:szCs w:val="22"/>
-        </w:rPr>
-        <w:t xml:space="preserve">The Investigation Plan is not a lesson for its own sake. Every part earns its place by what it lets you see about how students understand the concept. The </w:t>
-      </w:r>
-      <w:r>
-        <w:rPr>
-          <w:rFonts w:ascii="Calibri" w:hAnsi="Calibri" w:eastAsia="ＭＳ 明朝" w:cs="Calibri"/>
-          <w:i/>
-          <w:iCs/>
-          <w:color w:val="1F2933"/>
-          <w:kern w:val="0"/>
-          <w:sz w:val="22"/>
-          <w:szCs w:val="22"/>
-        </w:rPr>
-        <w:t>Before</w:t>
-      </w:r>
-      <w:r>
-        <w:rPr>
-          <w:rFonts w:ascii="Calibri" w:hAnsi="Calibri" w:eastAsia="ＭＳ 明朝" w:cs="Calibri"/>
-          <w:color w:val="1F2933"/>
-          <w:kern w:val="0"/>
-          <w:sz w:val="22"/>
-          <w:szCs w:val="22"/>
-        </w:rPr>
-        <w:t xml:space="preserve"> surfaces entry thinking. The </w:t>
-      </w:r>
-      <w:r>
-        <w:rPr>
-          <w:rFonts w:ascii="Calibri" w:hAnsi="Calibri" w:eastAsia="ＭＳ 明朝" w:cs="Calibri"/>
-          <w:i/>
-          <w:iCs/>
-          <w:color w:val="1F2933"/>
-          <w:kern w:val="0"/>
-          <w:sz w:val="22"/>
-          <w:szCs w:val="22"/>
-        </w:rPr>
-        <w:t>During</w:t>
-      </w:r>
-      <w:r>
-        <w:rPr>
-          <w:rFonts w:ascii="Calibri" w:hAnsi="Calibri" w:eastAsia="ＭＳ 明朝" w:cs="Calibri"/>
-          <w:color w:val="1F2933"/>
-          <w:kern w:val="0"/>
-          <w:sz w:val="22"/>
-          <w:szCs w:val="22"/>
-        </w:rPr>
-        <w:t xml:space="preserve"> provides evidence of student thinking through classroom-collected artifacts. The </w:t>
-      </w:r>
-      <w:r>
-        <w:rPr>
-          <w:rFonts w:ascii="Calibri" w:hAnsi="Calibri" w:eastAsia="ＭＳ 明朝" w:cs="Calibri"/>
-          <w:i/>
-          <w:iCs/>
-          <w:color w:val="1F2933"/>
-          <w:kern w:val="0"/>
-          <w:sz w:val="22"/>
-          <w:szCs w:val="22"/>
-        </w:rPr>
-        <w:t>After</w:t>
-      </w:r>
-      <w:r>
-        <w:rPr>
-          <w:rFonts w:ascii="Calibri" w:hAnsi="Calibri" w:eastAsia="ＭＳ 明朝" w:cs="Calibri"/>
-          <w:color w:val="1F2933"/>
-          <w:kern w:val="0"/>
-          <w:sz w:val="22"/>
-          <w:szCs w:val="22"/>
-        </w:rPr>
-        <w:t xml:space="preserve"> provides you with student thinking about the concept, once students have worked on your rich task with others. Assembled, it should read as one lesson pointed at one question, yours.</w:t>
-      </w:r>
-    </w:p>
-    <w:p>
-      <w:pPr>
-        <w:spacing w:before="0" w:after="160" w:line="276" w:lineRule="auto"/>
-        <w:jc w:val="start"/>
-      </w:pPr>
-      <w:r>
-        <w:rPr>
-          <w:rFonts w:ascii="Calibri" w:hAnsi="Calibri" w:eastAsia="ＭＳ 明朝" w:cs="Calibri"/>
-          <w:color w:val="1F2933"/>
-          <w:kern w:val="0"/>
-          <w:sz w:val="22"/>
-          <w:szCs w:val="22"/>
-        </w:rPr>
-        <w:t xml:space="preserve">The </w:t>
-      </w:r>
-      <w:r>
-        <w:rPr>
-          <w:rFonts w:ascii="Calibri" w:hAnsi="Calibri" w:eastAsia="ＭＳ 明朝" w:cs="Calibri"/>
-          <w:i/>
-          <w:iCs/>
-          <w:color w:val="1F2933"/>
-          <w:kern w:val="0"/>
-          <w:sz w:val="22"/>
-          <w:szCs w:val="22"/>
-        </w:rPr>
-        <w:t>After</w:t>
-      </w:r>
-      <w:r>
-        <w:rPr>
-          <w:rFonts w:ascii="Calibri" w:hAnsi="Calibri" w:eastAsia="ＭＳ 明朝" w:cs="Calibri"/>
-          <w:color w:val="1F2933"/>
-          <w:kern w:val="0"/>
-          <w:sz w:val="22"/>
-          <w:szCs w:val="22"/>
-        </w:rPr>
-        <w:t xml:space="preserve"> is the capture. Design something short you can collect, such as an exit slip, a closing discussion, a strategy gallery, or a one-on-one probe. An exit slip asks three or more Student Questions, each tied to your research question. The capture is required. Discussion questions are encouraged.</w:t>
-      </w:r>
-    </w:p>
-    <w:p>
-      <w:pPr>
-        <w:spacing w:before="0" w:after="160" w:line="276" w:lineRule="auto"/>
-        <w:jc w:val="start"/>
-      </w:pPr>
-      <w:r>
-        <w:rPr>
-          <w:rFonts w:ascii="Calibri" w:hAnsi="Calibri" w:eastAsia="ＭＳ 明朝" w:cs="Calibri"/>
-          <w:color w:val="1F2933"/>
-          <w:kern w:val="0"/>
-          <w:sz w:val="22"/>
-          <w:szCs w:val="22"/>
-        </w:rPr>
-        <w:t>A strong Investigation Plan reads as one lesson. As you assemble it, a few things to aim for:</w:t>
-      </w:r>
-    </w:p>
-    <w:p>
-      <w:pPr>
-        <w:pStyle w:val="ListBullet"/>
-        <w:spacing w:before="0" w:after="100" w:line="276" w:lineRule="auto"/>
-        <w:ind w:left="360" w:hanging="360"/>
-        <w:jc w:val="start"/>
-      </w:pPr>
-      <w:r>
-        <w:rPr>
-          <w:rFonts w:ascii="Calibri" w:hAnsi="Calibri" w:eastAsia="ＭＳ 明朝" w:cs="Calibri"/>
-          <w:b/>
-          <w:bCs/>
-          <w:color w:val="1F2933"/>
-          <w:kern w:val="0"/>
-          <w:sz w:val="22"/>
-          <w:szCs w:val="22"/>
-        </w:rPr>
-        <w:t>One lesson, one concept.</w:t>
-      </w:r>
-      <w:r>
-        <w:rPr>
-          <w:rFonts w:ascii="Calibri" w:hAnsi="Calibri" w:eastAsia="ＭＳ 明朝" w:cs="Calibri"/>
-          <w:color w:val="1F2933"/>
-          <w:kern w:val="0"/>
-          <w:sz w:val="22"/>
-          <w:szCs w:val="22"/>
-        </w:rPr>
-        <w:t xml:space="preserve"> The Before, During, and After follow each other and stay on the same mathematics.</w:t>
-      </w:r>
-    </w:p>
-    <w:p>
-      <w:pPr>
-        <w:pStyle w:val="ListBullet"/>
-        <w:spacing w:before="0" w:after="100" w:line="276" w:lineRule="auto"/>
-        <w:ind w:left="360" w:hanging="360"/>
-        <w:jc w:val="start"/>
-      </w:pPr>
-      <w:r>
-        <w:rPr>
-          <w:rFonts w:ascii="Calibri" w:hAnsi="Calibri" w:eastAsia="ＭＳ 明朝" w:cs="Calibri"/>
-          <w:b/>
-          <w:bCs/>
-          <w:color w:val="1F2933"/>
-          <w:kern w:val="0"/>
-          <w:sz w:val="22"/>
-          <w:szCs w:val="22"/>
-        </w:rPr>
-        <w:t>An After that captures thinking.</w:t>
-      </w:r>
-      <w:r>
-        <w:rPr>
-          <w:rFonts w:ascii="Calibri" w:hAnsi="Calibri" w:eastAsia="ＭＳ 明朝" w:cs="Calibri"/>
-          <w:color w:val="1F2933"/>
-          <w:kern w:val="0"/>
-          <w:sz w:val="22"/>
-          <w:szCs w:val="22"/>
-        </w:rPr>
-        <w:t xml:space="preserve"> The After leaves you holding something to look at later, a piece of the thinking.</w:t>
-      </w:r>
-    </w:p>
-    <w:p>
-      <w:pPr>
-        <w:pStyle w:val="ListBullet"/>
-        <w:spacing w:before="0" w:after="100" w:line="276" w:lineRule="auto"/>
-        <w:ind w:left="360" w:hanging="360"/>
-        <w:jc w:val="start"/>
-      </w:pPr>
-      <w:r>
-        <w:rPr>
-          <w:rFonts w:ascii="Calibri" w:hAnsi="Calibri" w:eastAsia="ＭＳ 明朝" w:cs="Calibri"/>
-          <w:b/>
-          <w:bCs/>
-          <w:color w:val="1F2933"/>
-          <w:kern w:val="0"/>
-          <w:sz w:val="22"/>
-          <w:szCs w:val="22"/>
-        </w:rPr>
-        <w:t>A plan pointed at your question.</w:t>
-      </w:r>
-      <w:r>
-        <w:rPr>
-          <w:rFonts w:ascii="Calibri" w:hAnsi="Calibri" w:eastAsia="ＭＳ 明朝" w:cs="Calibri"/>
-          <w:color w:val="1F2933"/>
-          <w:kern w:val="0"/>
-          <w:sz w:val="22"/>
-          <w:szCs w:val="22"/>
-        </w:rPr>
-        <w:t xml:space="preserve"> Read start to finish, the lesson is built to show you something about the question you are asking.</w:t>
-      </w:r>
-    </w:p>
-    <w:p>
-      <w:pPr>
-        <w:pStyle w:val="ListBullet"/>
-        <w:spacing w:before="0" w:after="100" w:line="276" w:lineRule="auto"/>
-        <w:ind w:left="360" w:hanging="360"/>
-        <w:jc w:val="start"/>
-      </w:pPr>
-      <w:r>
-        <w:rPr>
-          <w:rFonts w:ascii="Calibri" w:hAnsi="Calibri" w:eastAsia="ＭＳ 明朝" w:cs="Calibri"/>
-          <w:b/>
-          <w:bCs/>
-          <w:color w:val="1F2933"/>
-          <w:kern w:val="0"/>
-          <w:sz w:val="22"/>
-          <w:szCs w:val="22"/>
-        </w:rPr>
-        <w:t>A Before that opens the door.</w:t>
-      </w:r>
-      <w:r>
-        <w:rPr>
-          <w:rFonts w:ascii="Calibri" w:hAnsi="Calibri" w:eastAsia="ＭＳ 明朝" w:cs="Calibri"/>
-          <w:color w:val="1F2933"/>
-          <w:kern w:val="0"/>
-          <w:sz w:val="22"/>
-          <w:szCs w:val="22"/>
-        </w:rPr>
-        <w:t xml:space="preserve"> The Before gets students thinking about the concept and leaves the discovery in the task for them to make.</w:t>
-      </w:r>
-    </w:p>
-    <w:p>
-      <w:pPr>
-        <w:pStyle w:val="ListBullet"/>
-        <w:spacing w:before="0" w:after="100" w:line="276" w:lineRule="auto"/>
-        <w:ind w:left="360" w:hanging="360"/>
-        <w:jc w:val="start"/>
-      </w:pPr>
-      <w:r>
-        <w:rPr>
-          <w:rFonts w:ascii="Calibri" w:hAnsi="Calibri" w:eastAsia="ＭＳ 明朝" w:cs="Calibri"/>
-          <w:b/>
-          <w:bCs/>
-          <w:color w:val="1F2933"/>
-          <w:kern w:val="0"/>
-          <w:sz w:val="22"/>
-          <w:szCs w:val="22"/>
-        </w:rPr>
-        <w:t>A read you can name.</w:t>
-      </w:r>
-      <w:r>
-        <w:rPr>
-          <w:rFonts w:ascii="Calibri" w:hAnsi="Calibri" w:eastAsia="ＭＳ 明朝" w:cs="Calibri"/>
-          <w:color w:val="1F2933"/>
-          <w:kern w:val="0"/>
-          <w:sz w:val="22"/>
-          <w:szCs w:val="22"/>
-        </w:rPr>
-        <w:t xml:space="preserve"> Before you teach, you can say what you will look for in the work you collect, and what would not count as evidence.</w:t>
-      </w:r>
-    </w:p>
-    <w:p>
-      <w:pPr>
-        <w:spacing w:before="0" w:after="160" w:line="276" w:lineRule="auto"/>
-        <w:jc w:val="start"/>
-      </w:pPr>
-      <w:r>
-        <w:rPr>
-          <w:rFonts w:ascii="Calibri" w:hAnsi="Calibri" w:eastAsia="ＭＳ 明朝" w:cs="Calibri"/>
-          <w:color w:val="1F2933"/>
-          <w:kern w:val="0"/>
-          <w:sz w:val="22"/>
-          <w:szCs w:val="22"/>
-        </w:rPr>
-        <w:t>Keep one question in mind as you build: if I ran this with my students, what would it show me about my research question?</w:t>
-      </w:r>
-    </w:p>
-    <w:p>
-      <w:pPr>
-        <w:spacing w:before="320" w:after="120" w:line="276" w:lineRule="auto"/>
-        <w:jc w:val="start"/>
-      </w:pPr>
-      <w:r>
-        <w:rPr>
-          <w:rFonts w:ascii="Calibri" w:hAnsi="Calibri" w:eastAsia="ＭＳ 明朝" w:cs="Calibri"/>
-          <w:b/>
-          <w:bCs/>
-          <w:color w:val="0070C0"/>
-          <w:kern w:val="0"/>
           <w:sz w:val="24"/>
-          <w:szCs w:val="24"/>
         </w:rPr>
         <w:t>2. What Do I Need to Do?</w:t>
       </w:r>
     </w:p>
     <w:p>
       <w:pPr>
-        <w:spacing w:before="0" w:after="160" w:line="276" w:lineRule="auto"/>
-        <w:jc w:val="start"/>
+        <w:spacing w:after="40" w:before="0" w:line="259" w:lineRule="auto"/>
       </w:pPr>
       <w:r>
         <w:rPr>
-          <w:rFonts w:ascii="Calibri" w:hAnsi="Calibri" w:eastAsia="ＭＳ 明朝" w:cs="Calibri"/>
+          <w:b w:val="0"/>
+          <w:i w:val="0"/>
           <w:color w:val="1F2933"/>
-          <w:kern w:val="0"/>
-          <w:sz w:val="22"/>
-          <w:szCs w:val="22"/>
+          <w:sz w:val="21"/>
         </w:rPr>
-        <w:t>Your After comes from Week 9. This week your group and the genAI planning partner review the whole plan, and you revise it before you submit.</w:t>
+        <w:t>Complete each tab of the BDA Planner:</w:t>
       </w:r>
     </w:p>
     <w:p>
       <w:pPr>
-        <w:spacing w:before="200" w:after="60" w:line="276" w:lineRule="auto"/>
-        <w:jc w:val="start"/>
+        <w:pStyle w:val="ListBullet"/>
+        <w:spacing w:after="30" w:before="0" w:line="259" w:lineRule="auto"/>
       </w:pPr>
       <w:r>
         <w:rPr>
-          <w:rFonts w:ascii="Calibri" w:hAnsi="Calibri" w:eastAsia="ＭＳ 明朝" w:cs="Calibri"/>
           <w:b/>
-          <w:bCs/>
+          <w:i w:val="0"/>
           <w:color w:val="1F2933"/>
-          <w:kern w:val="0"/>
-          <w:sz w:val="24"/>
-          <w:szCs w:val="22"/>
+          <w:sz w:val="21"/>
         </w:rPr>
-        <w:t>Before Day 1</w:t>
+        <w:t xml:space="preserve">Concept Profile: </w:t>
+      </w:r>
+      <w:r>
+        <w:rPr>
+          <w:b w:val="0"/>
+          <w:i w:val="0"/>
+          <w:color w:val="1F2933"/>
+          <w:sz w:val="21"/>
+        </w:rPr>
+        <w:t>your research question, concept, standards, and focus students.</w:t>
       </w:r>
     </w:p>
     <w:p>
       <w:pPr>
-        <w:pStyle w:val="ListNumber"/>
-        <w:spacing w:before="0" w:after="100" w:line="276" w:lineRule="auto"/>
-        <w:ind w:left="360" w:hanging="360"/>
-        <w:jc w:val="start"/>
+        <w:pStyle w:val="ListBullet"/>
+        <w:spacing w:after="30" w:before="0" w:line="259" w:lineRule="auto"/>
       </w:pPr>
       <w:r>
         <w:rPr>
-          <w:rFonts w:ascii="Calibri" w:hAnsi="Calibri" w:eastAsia="ＭＳ 明朝" w:cs="Calibri"/>
           <w:b/>
-          <w:bCs/>
+          <w:i w:val="0"/>
           <w:color w:val="1F2933"/>
-          <w:kern w:val="0"/>
-          <w:sz w:val="22"/>
-          <w:szCs w:val="22"/>
+          <w:sz w:val="21"/>
         </w:rPr>
-        <w:t>Finish your After, the capture.</w:t>
+        <w:t xml:space="preserve">Plan → Before: </w:t>
       </w:r>
       <w:r>
         <w:rPr>
-          <w:rFonts w:ascii="Calibri" w:hAnsi="Calibri" w:eastAsia="ＭＳ 明朝" w:cs="Calibri"/>
+          <w:b w:val="0"/>
+          <w:i w:val="0"/>
           <w:color w:val="1F2933"/>
-          <w:kern w:val="0"/>
-          <w:sz w:val="22"/>
-          <w:szCs w:val="22"/>
+          <w:sz w:val="21"/>
         </w:rPr>
-        <w:t xml:space="preserve"> You designed it in Week 9 in the BDA Planner (Plan → After): an exit slip, a closing discussion, a strategy gallery, or a one-on-one probe. For an exit slip, that means three or more Student Questions, each with how it helps answer your research question. The capture is required.</w:t>
+        <w:t>a routine that warms up the same math without giving away the task.</w:t>
       </w:r>
     </w:p>
     <w:p>
       <w:pPr>
-        <w:pStyle w:val="ListNumber"/>
-        <w:spacing w:before="0" w:after="100" w:line="276" w:lineRule="auto"/>
-        <w:ind w:left="360" w:hanging="360"/>
-        <w:jc w:val="start"/>
+        <w:pStyle w:val="ListBullet"/>
+        <w:spacing w:after="30" w:before="0" w:line="259" w:lineRule="auto"/>
       </w:pPr>
       <w:r>
         <w:rPr>
-          <w:rFonts w:ascii="Calibri" w:hAnsi="Calibri" w:eastAsia="ＭＳ 明朝" w:cs="Calibri"/>
           <w:b/>
-          <w:bCs/>
+          <w:i w:val="0"/>
           <w:color w:val="1F2933"/>
-          <w:kern w:val="0"/>
-          <w:sz w:val="22"/>
-          <w:szCs w:val="22"/>
+          <w:sz w:val="21"/>
         </w:rPr>
-        <w:t>Name your read.</w:t>
+        <w:t xml:space="preserve">Plan → During: </w:t>
       </w:r>
       <w:r>
         <w:rPr>
-          <w:rFonts w:ascii="Calibri" w:hAnsi="Calibri" w:eastAsia="ＭＳ 明朝" w:cs="Calibri"/>
+          <w:b w:val="0"/>
+          <w:i w:val="0"/>
           <w:color w:val="1F2933"/>
-          <w:kern w:val="0"/>
-          <w:sz w:val="22"/>
-          <w:szCs w:val="22"/>
+          <w:sz w:val="21"/>
         </w:rPr>
-        <w:t xml:space="preserve"> Fill in the Assessment section of the plan. Say what you will look for in the work students produce on the task and on the After. Which strategies, representations, or explanations would count as evidence that a student understands the concept? Which would not? Name the Depth of Knowledge the task asks for, too. In Week 5 you scored the same student work with several rubrics and saw how much the choice of rubric mattered. Here you choose your own. Whatever you write in this section is what you will use to read your data for the Final Report.</w:t>
+        <w:t>your rich task, with key questions and anticipated student responses.</w:t>
       </w:r>
     </w:p>
     <w:p>
       <w:pPr>
-        <w:pStyle w:val="ListNumber"/>
-        <w:spacing w:before="0" w:after="100" w:line="276" w:lineRule="auto"/>
-        <w:ind w:left="360" w:hanging="360"/>
-        <w:jc w:val="start"/>
+        <w:pStyle w:val="ListBullet"/>
+        <w:spacing w:after="30" w:before="0" w:line="259" w:lineRule="auto"/>
       </w:pPr>
       <w:r>
         <w:rPr>
-          <w:rFonts w:ascii="Calibri" w:hAnsi="Calibri" w:eastAsia="ＭＳ 明朝" w:cs="Calibri"/>
           <w:b/>
-          <w:bCs/>
+          <w:i w:val="0"/>
           <w:color w:val="1F2933"/>
-          <w:kern w:val="0"/>
-          <w:sz w:val="22"/>
-          <w:szCs w:val="22"/>
+          <w:sz w:val="21"/>
         </w:rPr>
-        <w:t>Assemble your Before, During, and After into the Investigation Plan.</w:t>
+        <w:t xml:space="preserve">Plan → After: </w:t>
       </w:r>
       <w:r>
         <w:rPr>
-          <w:rFonts w:ascii="Calibri" w:hAnsi="Calibri" w:eastAsia="ＭＳ 明朝" w:cs="Calibri"/>
+          <w:b w:val="0"/>
+          <w:i w:val="0"/>
           <w:color w:val="1F2933"/>
-          <w:kern w:val="0"/>
-          <w:sz w:val="22"/>
-          <w:szCs w:val="22"/>
+          <w:sz w:val="21"/>
         </w:rPr>
-        <w:t xml:space="preserve"> In the BDA Planner, go to Share and press Generate Investigation Plan. It lays out everything you've written as the course's 3-Pager. If something is still empty (standards, anticipated responses, timing), write it in the Planner and generate again. Then check the seams: does it read as one lesson, does the Before stay clear of the During’s move, does the After capture what the During surfaces?</w:t>
+        <w:t>what you collect. An exit slip needs three or more Student Questions, each tied to your research question. Step 4, What it captures, becomes your plan’s Assessment.</w:t>
       </w:r>
     </w:p>
     <w:p>
       <w:pPr>
-        <w:pageBreakBefore/>
-        <w:spacing w:before="200" w:after="60" w:line="276" w:lineRule="auto"/>
-        <w:jc w:val="start"/>
+        <w:pStyle w:val="ListBullet"/>
+        <w:spacing w:after="30" w:before="0" w:line="259" w:lineRule="auto"/>
       </w:pPr>
       <w:r>
         <w:rPr>
-          <w:rFonts w:ascii="Calibri" w:hAnsi="Calibri" w:eastAsia="ＭＳ 明朝" w:cs="Calibri"/>
           <w:b/>
-          <w:bCs/>
+          <w:i w:val="0"/>
           <w:color w:val="1F2933"/>
-          <w:kern w:val="0"/>
-          <w:sz w:val="24"/>
-          <w:szCs w:val="22"/>
+          <w:sz w:val="21"/>
         </w:rPr>
-        <w:t>Day 1: review in groups of three</w:t>
+        <w:t xml:space="preserve">Review (Day 1): </w:t>
+      </w:r>
+      <w:r>
+        <w:rPr>
+          <w:b w:val="0"/>
+          <w:i w:val="0"/>
+          <w:color w:val="1F2933"/>
+          <w:sz w:val="21"/>
+        </w:rPr>
+        <w:t>your group of three reads your plan first. Then press Check this on the Before, the During, and the After.</w:t>
       </w:r>
     </w:p>
     <w:p>
       <w:pPr>
-        <w:pStyle w:val="ListNumber"/>
-        <w:spacing w:before="0" w:after="100" w:line="276" w:lineRule="auto"/>
-        <w:ind w:left="360" w:hanging="360"/>
-        <w:jc w:val="start"/>
+        <w:pStyle w:val="ListBullet"/>
+        <w:spacing w:after="30" w:before="0" w:line="259" w:lineRule="auto"/>
       </w:pPr>
       <w:r>
         <w:rPr>
-          <w:rFonts w:ascii="Calibri" w:hAnsi="Calibri" w:eastAsia="ＭＳ 明朝" w:cs="Calibri"/>
           <w:b/>
-          <w:bCs/>
+          <w:i w:val="0"/>
           <w:color w:val="1F2933"/>
-          <w:kern w:val="0"/>
-          <w:sz w:val="22"/>
-          <w:szCs w:val="22"/>
+          <w:sz w:val="21"/>
         </w:rPr>
-        <w:t>Share your whole plan and your research question</w:t>
+        <w:t xml:space="preserve">Share (Day 2): </w:t>
       </w:r>
       <w:r>
         <w:rPr>
-          <w:rFonts w:ascii="Calibri" w:hAnsi="Calibri" w:eastAsia="ＭＳ 明朝" w:cs="Calibri"/>
+          <w:b w:val="0"/>
+          <w:i w:val="0"/>
           <w:color w:val="1F2933"/>
-          <w:kern w:val="0"/>
-          <w:sz w:val="22"/>
-          <w:szCs w:val="22"/>
+          <w:sz w:val="21"/>
         </w:rPr>
-        <w:t xml:space="preserve"> with your group of three, so they know what the plan is trying to find out. Have them read the whole plan and pressure-test it against your question, with the After in focus. Would students’ responses give you insight into your question? Where could a student get through the lesson without revealing their thinking? Is the Before contaminating the During? Capture their feedback.</w:t>
+        <w:t>revise from both reads, write one paragraph on how the feedback shaped your After, then press Generate Investigation Plan — PDF and submit that one file in Canvas.</w:t>
       </w:r>
     </w:p>
     <w:p>
       <w:pPr>
-        <w:pStyle w:val="ListNumber"/>
-        <w:spacing w:before="0" w:after="100" w:line="276" w:lineRule="auto"/>
-        <w:ind w:left="360" w:hanging="360"/>
-        <w:jc w:val="start"/>
+        <w:spacing w:after="60" w:before="60" w:line="259" w:lineRule="auto"/>
       </w:pPr>
       <w:r>
         <w:rPr>
-          <w:rFonts w:ascii="Calibri" w:hAnsi="Calibri" w:eastAsia="ＭＳ 明朝" w:cs="Calibri"/>
           <w:b/>
-          <w:bCs/>
+          <w:i w:val="0"/>
           <w:color w:val="1F2933"/>
-          <w:kern w:val="0"/>
-          <w:sz w:val="22"/>
-          <w:szCs w:val="22"/>
+          <w:sz w:val="21"/>
         </w:rPr>
-        <w:t>Then press Check this on each of the three panes in the BDA Planner — Before, During, After —</w:t>
+        <w:t xml:space="preserve">Pseudonyms only. </w:t>
       </w:r>
       <w:r>
         <w:rPr>
-          <w:rFonts w:ascii="Calibri" w:hAnsi="Calibri" w:eastAsia="ＭＳ 明朝" w:cs="Calibri"/>
+          <w:b w:val="0"/>
+          <w:i w:val="0"/>
           <w:color w:val="1F2933"/>
-          <w:kern w:val="0"/>
-          <w:sz w:val="22"/>
-          <w:szCs w:val="22"/>
+          <w:sz w:val="21"/>
         </w:rPr>
-        <w:t xml:space="preserve"> using the prompt after the rubric. Read its whole-plan audit and follow up.</w:t>
+        <w:t xml:space="preserve">No student names or identifying details anywhere (FERPA). </w:t>
+      </w:r>
+      <w:r>
+        <w:rPr>
+          <w:b/>
+          <w:i w:val="0"/>
+          <w:color w:val="1F2933"/>
+          <w:sz w:val="21"/>
+        </w:rPr>
+        <w:t xml:space="preserve">The plan is yours. </w:t>
+      </w:r>
+      <w:r>
+        <w:rPr>
+          <w:b w:val="0"/>
+          <w:i w:val="0"/>
+          <w:color w:val="1F2933"/>
+          <w:sz w:val="21"/>
+        </w:rPr>
+        <w:t>You may teach the same lesson as the classmate you’re placed with, but each of you builds and submits your own.</w:t>
       </w:r>
     </w:p>
     <w:p>
       <w:pPr>
-        <w:spacing w:before="200" w:after="60" w:line="276" w:lineRule="auto"/>
-        <w:jc w:val="start"/>
+        <w:spacing w:after="40" w:before="140" w:line="259" w:lineRule="auto"/>
       </w:pPr>
       <w:r>
         <w:rPr>
-          <w:rFonts w:ascii="Calibri" w:hAnsi="Calibri" w:eastAsia="ＭＳ 明朝" w:cs="Calibri"/>
           <w:b/>
-          <w:bCs/>
+          <w:i w:val="0"/>
           <w:color w:val="1F2933"/>
-          <w:kern w:val="0"/>
           <w:sz w:val="24"/>
-          <w:szCs w:val="22"/>
         </w:rPr>
-        <w:t>Day 2: revision</w:t>
-      </w:r>
-    </w:p>
-    <w:p>
-      <w:pPr>
-        <w:spacing w:before="0" w:after="160" w:line="276" w:lineRule="auto"/>
-        <w:jc w:val="start"/>
-      </w:pPr>
-      <w:r>
-        <w:rPr>
-          <w:rFonts w:ascii="Calibri" w:hAnsi="Calibri" w:eastAsia="ＭＳ 明朝" w:cs="Calibri"/>
-          <w:color w:val="1F2933"/>
-          <w:kern w:val="0"/>
-          <w:sz w:val="22"/>
-          <w:szCs w:val="22"/>
-        </w:rPr>
-        <w:t xml:space="preserve">Revise your Investigation Plan from both reads. </w:t>
-      </w:r>
-      <w:r>
-        <w:rPr>
-          <w:rFonts w:ascii="Calibri" w:hAnsi="Calibri" w:eastAsia="ＭＳ 明朝" w:cs="Calibri"/>
-          <w:b/>
-          <w:bCs/>
-          <w:color w:val="1F2933"/>
-          <w:kern w:val="0"/>
-          <w:sz w:val="22"/>
-          <w:szCs w:val="22"/>
-        </w:rPr>
-        <w:t>Submit the revised plan, with your reflection on the feedback inside it</w:t>
-      </w:r>
-      <w:r>
-        <w:rPr>
-          <w:rFonts w:ascii="Calibri" w:hAnsi="Calibri" w:eastAsia="ＭＳ 明朝" w:cs="Calibri"/>
-          <w:color w:val="1F2933"/>
-          <w:kern w:val="0"/>
-          <w:sz w:val="22"/>
-          <w:szCs w:val="22"/>
-        </w:rPr>
-        <w:t xml:space="preserve">.</w:t>
-      </w:r>
-    </w:p>
-    <w:p>
-      <w:pPr>
-        <w:spacing w:before="320" w:after="120" w:line="276" w:lineRule="auto"/>
-        <w:jc w:val="start"/>
-      </w:pPr>
-      <w:r>
-        <w:rPr>
-          <w:rFonts w:ascii="Calibri" w:hAnsi="Calibri" w:eastAsia="ＭＳ 明朝" w:cs="Calibri"/>
-          <w:b/>
-          <w:bCs/>
-          <w:color w:val="0070C0"/>
-          <w:kern w:val="0"/>
-          <w:sz w:val="24"/>
-          <w:szCs w:val="24"/>
-        </w:rPr>
-        <w:t>3. What You Submit</w:t>
-      </w:r>
-    </w:p>
-    <w:p>
-      <w:pPr>
-        <w:spacing w:before="0" w:after="160" w:line="276" w:lineRule="auto"/>
-        <w:jc w:val="start"/>
-      </w:pPr>
-      <w:r>
-        <w:rPr>
-          <w:rFonts w:ascii="Calibri" w:hAnsi="Calibri" w:eastAsia="ＭＳ 明朝" w:cs="Calibri"/>
-          <w:color w:val="1F2933"/>
-          <w:kern w:val="0"/>
-          <w:sz w:val="22"/>
-          <w:szCs w:val="22"/>
-        </w:rPr>
-        <w:t>One PDF, submitted in Canvas: the Investigation Plan you generate from the BDA Planner (Share → Generate Investigation Plan). It holds:</w:t>
-      </w:r>
-    </w:p>
-    <w:p>
-      <w:pPr>
-        <w:pStyle w:val="ListBullet"/>
-        <w:spacing w:before="0" w:after="100" w:line="276" w:lineRule="auto"/>
-        <w:ind w:left="360" w:hanging="360"/>
-        <w:jc w:val="start"/>
-      </w:pPr>
-      <w:r>
-        <w:rPr>
-          <w:rFonts w:ascii="Calibri" w:hAnsi="Calibri" w:eastAsia="ＭＳ 明朝" w:cs="Calibri"/>
-          <w:b/>
-          <w:bCs/>
-          <w:color w:val="1F2933"/>
-          <w:kern w:val="0"/>
-          <w:sz w:val="22"/>
-          <w:szCs w:val="22"/>
-        </w:rPr>
-        <w:t>Your revised plan.</w:t>
-      </w:r>
-      <w:r>
-        <w:rPr>
-          <w:rFonts w:ascii="Calibri" w:hAnsi="Calibri" w:eastAsia="ＭＳ 明朝" w:cs="Calibri"/>
-          <w:color w:val="1F2933"/>
-          <w:kern w:val="0"/>
-          <w:sz w:val="22"/>
-          <w:szCs w:val="22"/>
-        </w:rPr>
-        <w:t xml:space="preserve"> The completed plan (research question, Before, During, After, and how you will read the evidence), revised in response to your group’s review. This is the plan you carry into the field.</w:t>
-      </w:r>
-    </w:p>
-    <w:p>
-      <w:pPr>
-        <w:pStyle w:val="ListBullet"/>
-        <w:spacing w:before="0" w:after="100" w:line="276" w:lineRule="auto"/>
-        <w:ind w:left="360" w:hanging="360"/>
-        <w:jc w:val="start"/>
-      </w:pPr>
-      <w:r>
-        <w:rPr>
-          <w:rFonts w:ascii="Calibri" w:hAnsi="Calibri" w:eastAsia="ＭＳ 明朝" w:cs="Calibri"/>
-          <w:b/>
-          <w:bCs/>
-          <w:color w:val="1F2933"/>
-          <w:kern w:val="0"/>
-          <w:sz w:val="22"/>
-          <w:szCs w:val="22"/>
-        </w:rPr>
-        <w:t>Your reflection on the feedback.</w:t>
-      </w:r>
-      <w:r>
-        <w:rPr>
-          <w:rFonts w:ascii="Calibri" w:hAnsi="Calibri" w:eastAsia="ＭＳ 明朝" w:cs="Calibri"/>
-          <w:color w:val="1F2933"/>
-          <w:kern w:val="0"/>
-          <w:sz w:val="22"/>
-          <w:szCs w:val="22"/>
-        </w:rPr>
-        <w:t xml:space="preserve"> One paragraph, written on the Planner's Share tab. Your After went through two reads, your group and the genAI planning partner. How useful were they as you planned and revised it? Be specific about your After: what changed from your early drafts, what did you set aside, and why? The genAI planning partner's reads print as an appendix. The plan is yours. We are assessing the judgment you brought to the critiques, not proof that you received them. Keep this document: you read it again in December, when the Final Report asks for a short account of how AI helped you.</w:t>
-      </w:r>
-    </w:p>
-    <w:p>
-      <w:pPr>
-        <w:pStyle w:val="ListBullet"/>
-        <w:spacing w:before="0" w:after="100" w:line="276" w:lineRule="auto"/>
-        <w:ind w:left="360" w:hanging="360"/>
-        <w:jc w:val="start"/>
-      </w:pPr>
-      <w:r>
-        <w:rPr>
-          <w:rFonts w:ascii="Calibri" w:hAnsi="Calibri" w:eastAsia="ＭＳ 明朝" w:cs="Calibri"/>
-          <w:b/>
-          <w:bCs/>
-          <w:color w:val="1F2933"/>
-          <w:kern w:val="0"/>
-          <w:sz w:val="22"/>
-          <w:szCs w:val="22"/>
-        </w:rPr>
-        <w:t>Pseudonym only.</w:t>
-      </w:r>
-      <w:r>
-        <w:rPr>
-          <w:rFonts w:ascii="Calibri" w:hAnsi="Calibri" w:eastAsia="ＭＳ 明朝" w:cs="Calibri"/>
-          <w:color w:val="1F2933"/>
-          <w:kern w:val="0"/>
-          <w:sz w:val="22"/>
-          <w:szCs w:val="22"/>
-        </w:rPr>
-        <w:t xml:space="preserve"> No student names or identifying details anywhere (FERPA).</w:t>
-      </w:r>
-    </w:p>
-    <w:p>
-      <w:pPr>
-        <w:spacing w:before="320" w:after="120" w:line="276" w:lineRule="auto"/>
-        <w:jc w:val="start"/>
-      </w:pPr>
-      <w:r>
-        <w:rPr>
-          <w:rFonts w:ascii="Calibri" w:hAnsi="Calibri" w:eastAsia="ＭＳ 明朝" w:cs="Calibri"/>
-          <w:b/>
-          <w:bCs/>
-          <w:color w:val="0070C0"/>
-          <w:kern w:val="0"/>
-          <w:sz w:val="24"/>
-          <w:szCs w:val="24"/>
-        </w:rPr>
-        <w:t>4. Working Collaboratively</w:t>
-      </w:r>
-    </w:p>
-    <w:p>
-      <w:pPr>
-        <w:spacing w:before="0" w:after="160" w:line="276" w:lineRule="auto"/>
-        <w:jc w:val="start"/>
-      </w:pPr>
-      <w:r>
-        <w:rPr>
-          <w:rFonts w:ascii="Calibri" w:hAnsi="Calibri" w:eastAsia="ＭＳ 明朝" w:cs="Calibri"/>
-          <w:color w:val="1F2933"/>
-          <w:kern w:val="0"/>
-          <w:sz w:val="22"/>
-          <w:szCs w:val="22"/>
-        </w:rPr>
-        <w:t>The plan is yours, built to investigate your concept and aimed at your question. You will workshop it with classmates, but the Investigation Plan you submit and defend is your instrument. You may teach the same lesson as the classmate you're placed with, but each of you answers your own research question and submits your own work.</w:t>
-      </w:r>
-    </w:p>
-    <w:p>
-      <w:pPr>
-        <w:numPr>
-          <w:ilvl w:val="0"/>
-          <w:numId w:val="1"/>
-        </w:numPr>
-        <w:spacing w:before="0" w:after="160" w:line="276" w:lineRule="auto"/>
-        <w:ind w:left="360" w:hanging="360"/>
-        <w:jc w:val="start"/>
-      </w:pPr>
-      <w:r>
-        <w:rPr>
-          <w:rFonts w:ascii="Calibri" w:hAnsi="Calibri" w:eastAsia="ＭＳ 明朝" w:cs="Calibri"/>
-          <w:color w:val="1F2933"/>
-          <w:kern w:val="0"/>
-          <w:sz w:val="22"/>
-          <w:szCs w:val="22"/>
-        </w:rPr>
-        <w:t>Your group reviews your plan; they don't help build it.</w:t>
-      </w:r>
-    </w:p>
-    <w:p>
-      <w:pPr>
-        <w:numPr>
-          <w:ilvl w:val="0"/>
-          <w:numId w:val="1"/>
-        </w:numPr>
-        <w:spacing w:before="0" w:after="160" w:line="276" w:lineRule="auto"/>
-        <w:ind w:left="360" w:hanging="360"/>
-        <w:jc w:val="start"/>
-      </w:pPr>
-      <w:r>
-        <w:rPr>
-          <w:rFonts w:ascii="Calibri" w:hAnsi="Calibri" w:eastAsia="ＭＳ 明朝" w:cs="Calibri"/>
-          <w:color w:val="1F2933"/>
-          <w:kern w:val="0"/>
-          <w:sz w:val="22"/>
-          <w:szCs w:val="22"/>
-        </w:rPr>
-        <w:t>Human first: your group reviews your plan before the genAI planning partner does. You bring what you learn from that review to the BDA Planner, not the other way around. Both read your design. Neither one makes it for you.</w:t>
-      </w:r>
-    </w:p>
-    <w:p>
-      <w:pPr>
-        <w:numPr>
-          <w:ilvl w:val="0"/>
-          <w:numId w:val="1"/>
-        </w:numPr>
-        <w:spacing w:before="0" w:after="160" w:line="276" w:lineRule="auto"/>
-        <w:ind w:left="360" w:hanging="360"/>
-        <w:jc w:val="start"/>
-      </w:pPr>
-      <w:r>
-        <w:rPr>
-          <w:rFonts w:ascii="Calibri" w:hAnsi="Calibri" w:eastAsia="ＭＳ 明朝" w:cs="Calibri"/>
-          <w:color w:val="1F2933"/>
-          <w:kern w:val="0"/>
-          <w:sz w:val="22"/>
-          <w:szCs w:val="22"/>
-        </w:rPr>
-        <w:t>The genAI planning partner is a critic: it pressure-tests whether the whole plan gives you insight into your question and whether the After captures real evidence. It does not design the lesson for you. The design judgment is yours.</w:t>
-      </w:r>
-    </w:p>
-    <w:p>
-      <w:pPr>
-        <w:pageBreakBefore/>
-        <w:spacing w:line="240" w:lineRule="auto"/>
-        <w:jc w:val="start"/>
-      </w:pPr>
-      <w:r>
-        <w:lastRenderedPageBreak/>
-      </w:r>
-    </w:p>
-    <w:p>
-      <w:pPr>
-        <w:spacing w:before="320" w:after="120" w:line="276" w:lineRule="auto"/>
-        <w:jc w:val="start"/>
-      </w:pPr>
-      <w:r>
-        <w:rPr>
-          <w:rFonts w:ascii="Calibri" w:hAnsi="Calibri" w:eastAsia="ＭＳ 明朝" w:cs="Calibri"/>
-          <w:b/>
-          <w:bCs/>
-          <w:color w:val="0070C0"/>
-          <w:kern w:val="0"/>
-          <w:sz w:val="24"/>
-          <w:szCs w:val="24"/>
-        </w:rPr>
-        <w:t>5. How Is My Work Being Assessed?</w:t>
+        <w:t>3. How Will My Work Be Assessed?</w:t>
       </w:r>
     </w:p>
     <w:tbl>
       <w:tblPr>
         <w:tblStyle w:val="TableGrid"/>
-        <w:tblW w:w="0" w:type="auto"/>
-        <w:tblBorders>
-          <w:top w:val="single" w:sz="4" w:space="0" w:color="auto"/>
-          <w:left w:val="single" w:sz="4" w:space="0" w:color="auto"/>
-          <w:bottom w:val="single" w:sz="4" w:space="0" w:color="auto"/>
-          <w:right w:val="single" w:sz="4" w:space="0" w:color="auto"/>
-          <w:insideH w:val="single" w:sz="4" w:space="0" w:color="auto"/>
-          <w:insideV w:val="single" w:sz="4" w:space="0" w:color="auto"/>
-        </w:tblBorders>
+        <w:tblW w:type="auto" w:w="0"/>
+        <w:jc w:val="center"/>
         <w:tblLayout w:type="fixed"/>
-        <w:tblCellMar>
-          <w:top w:w="0" w:type="dxa"/>
-          <w:left w:w="108" w:type="dxa"/>
-          <w:bottom w:w="0" w:type="dxa"/>
-          <w:right w:w="108" w:type="dxa"/>
-        </w:tblCellMar>
-        <w:tblLook w:firstRow="1" w:firstColumn="1" w:noVBand="1"/>
+        <w:tblLook w:firstColumn="1" w:firstRow="1" w:lastColumn="0" w:lastRow="0" w:noHBand="0" w:noVBand="1" w:val="04A0"/>
+        <w:tblLayout w:type="fixed"/>
       </w:tblPr>
       <w:tblGrid>
-        <w:gridCol w:w="1824"/>
-        <w:gridCol w:w="7824"/>
+        <w:gridCol w:w="2232"/>
+        <w:gridCol w:w="792"/>
+        <w:gridCol w:w="6912"/>
       </w:tblGrid>
       <w:tr>
         <w:tc>
           <w:tcPr>
-            <w:tcW w:w="1824" w:type="dxa"/>
-            <w:tcBorders>
-              <w:top w:val="single" w:sz="4" w:space="0" w:color="auto"/>
-              <w:left w:val="single" w:sz="4" w:space="0" w:color="auto"/>
-              <w:bottom w:val="single" w:sz="4" w:space="0" w:color="auto"/>
-              <w:right w:val="single" w:sz="4" w:space="0" w:color="auto"/>
-            </w:tcBorders>
-            <w:shd w:val="clear" w:fill="BFBFBF"/>
-            <w:tcMar>
-              <w:top w:w="0" w:type="dxa"/>
-              <w:left w:w="108" w:type="dxa"/>
-              <w:bottom w:w="0" w:type="dxa"/>
-              <w:right w:w="108" w:type="dxa"/>
-            </w:tcMar>
+            <w:tcW w:type="dxa" w:w="2232"/>
+            <w:shd w:val="clear" w:color="auto" w:fill="E8EEF6"/>
           </w:tcPr>
           <w:p>
             <w:pPr>
-              <w:spacing w:line="240" w:lineRule="auto"/>
-              <w:jc w:val="start"/>
+              <w:spacing w:after="0" w:line="240" w:lineRule="auto"/>
             </w:pPr>
+            <w:r/>
             <w:r>
               <w:rPr>
-                <w:rFonts w:ascii="Calibri" w:hAnsi="Calibri" w:eastAsia="ＭＳ 明朝" w:cs="Calibri"/>
                 <w:b/>
-                <w:bCs/>
                 <w:color w:val="1F2933"/>
-                <w:kern w:val="0"/>
-                <w:sz w:val="22"/>
-                <w:szCs w:val="22"/>
+                <w:sz w:val="19"/>
               </w:rPr>
-              <w:t>Criteria</w:t>
+              <w:t>Criterion</w:t>
             </w:r>
           </w:p>
         </w:tc>
         <w:tc>
           <w:tcPr>
-            <w:tcW w:w="7824" w:type="dxa"/>
-            <w:tcBorders>
-              <w:top w:val="single" w:sz="4" w:space="0" w:color="auto"/>
-              <w:left w:val="single" w:sz="4" w:space="0" w:color="auto"/>
-              <w:bottom w:val="single" w:sz="4" w:space="0" w:color="auto"/>
-              <w:right w:val="single" w:sz="4" w:space="0" w:color="auto"/>
-            </w:tcBorders>
-            <w:shd w:val="clear" w:fill="BFBFBF"/>
-            <w:tcMar>
-              <w:top w:w="0" w:type="dxa"/>
-              <w:left w:w="108" w:type="dxa"/>
-              <w:bottom w:w="0" w:type="dxa"/>
-              <w:right w:w="108" w:type="dxa"/>
-            </w:tcMar>
+            <w:tcW w:type="dxa" w:w="792"/>
+            <w:shd w:val="clear" w:color="auto" w:fill="E8EEF6"/>
           </w:tcPr>
           <w:p>
             <w:pPr>
-              <w:spacing w:line="240" w:lineRule="auto"/>
-              <w:jc w:val="start"/>
+              <w:spacing w:after="0" w:line="240" w:lineRule="auto"/>
             </w:pPr>
+            <w:r/>
             <w:r>
               <w:rPr>
-                <w:rFonts w:ascii="Calibri" w:hAnsi="Calibri" w:eastAsia="ＭＳ 明朝" w:cs="Calibri"/>
                 <w:b/>
-                <w:bCs/>
                 <w:color w:val="1F2933"/>
-                <w:kern w:val="0"/>
-                <w:sz w:val="22"/>
-                <w:szCs w:val="22"/>
+                <w:sz w:val="19"/>
               </w:rPr>
-              <w:t>Expectations</w:t>
+              <w:t>Points</w:t>
+            </w:r>
+          </w:p>
+        </w:tc>
+        <w:tc>
+          <w:tcPr>
+            <w:tcW w:type="dxa" w:w="6912"/>
+            <w:shd w:val="clear" w:color="auto" w:fill="E8EEF6"/>
+          </w:tcPr>
+          <w:p>
+            <w:pPr>
+              <w:spacing w:after="0" w:line="240" w:lineRule="auto"/>
+            </w:pPr>
+            <w:r/>
+            <w:r>
+              <w:rPr>
+                <w:b/>
+                <w:color w:val="1F2933"/>
+                <w:sz w:val="19"/>
+              </w:rPr>
+              <w:t>What earns full credit</w:t>
             </w:r>
           </w:p>
         </w:tc>
@@ -1020,69 +364,58 @@
       <w:tr>
         <w:tc>
           <w:tcPr>
-            <w:tcW w:w="1824" w:type="dxa"/>
-            <w:tcBorders>
-              <w:top w:val="single" w:sz="4" w:space="0" w:color="auto"/>
-              <w:left w:val="single" w:sz="4" w:space="0" w:color="auto"/>
-              <w:bottom w:val="single" w:sz="4" w:space="0" w:color="auto"/>
-              <w:right w:val="single" w:sz="4" w:space="0" w:color="auto"/>
-            </w:tcBorders>
-            <w:tcMar>
-              <w:top w:w="0" w:type="dxa"/>
-              <w:left w:w="108" w:type="dxa"/>
-              <w:bottom w:w="0" w:type="dxa"/>
-              <w:right w:w="108" w:type="dxa"/>
-            </w:tcMar>
+            <w:tcW w:type="dxa" w:w="2232"/>
           </w:tcPr>
           <w:p>
             <w:pPr>
-              <w:spacing w:line="240" w:lineRule="auto"/>
-              <w:jc w:val="start"/>
+              <w:spacing w:after="0" w:line="240" w:lineRule="auto"/>
             </w:pPr>
+            <w:r/>
             <w:r>
               <w:rPr>
-                <w:rFonts w:ascii="Calibri" w:hAnsi="Calibri" w:eastAsia="ＭＳ 明朝" w:cs="Calibri"/>
                 <w:b/>
-                <w:bCs/>
                 <w:color w:val="1F2933"/>
-                <w:kern w:val="0"/>
-                <w:sz w:val="22"/>
-                <w:szCs w:val="22"/>
+                <w:sz w:val="19"/>
               </w:rPr>
-              <w:t>One lesson, one concept (5)</w:t>
+              <w:t>Before</w:t>
             </w:r>
           </w:p>
         </w:tc>
         <w:tc>
           <w:tcPr>
-            <w:tcW w:w="7824" w:type="dxa"/>
-            <w:tcBorders>
-              <w:top w:val="single" w:sz="4" w:space="0" w:color="auto"/>
-              <w:left w:val="single" w:sz="4" w:space="0" w:color="auto"/>
-              <w:bottom w:val="single" w:sz="4" w:space="0" w:color="auto"/>
-              <w:right w:val="single" w:sz="4" w:space="0" w:color="auto"/>
-            </w:tcBorders>
-            <w:tcMar>
-              <w:top w:w="0" w:type="dxa"/>
-              <w:left w:w="108" w:type="dxa"/>
-              <w:bottom w:w="0" w:type="dxa"/>
-              <w:right w:w="108" w:type="dxa"/>
-            </w:tcMar>
+            <w:tcW w:type="dxa" w:w="792"/>
           </w:tcPr>
           <w:p>
             <w:pPr>
-              <w:spacing w:line="240" w:lineRule="auto"/>
-              <w:jc w:val="start"/>
+              <w:spacing w:after="0" w:line="240" w:lineRule="auto"/>
             </w:pPr>
+            <w:r/>
             <w:r>
               <w:rPr>
-                <w:rFonts w:ascii="Calibri" w:hAnsi="Calibri" w:eastAsia="ＭＳ 明朝" w:cs="Calibri"/>
+                <w:b w:val="0"/>
                 <w:color w:val="1F2933"/>
-                <w:kern w:val="0"/>
-                <w:sz w:val="22"/>
-                <w:szCs w:val="22"/>
+                <w:sz w:val="19"/>
               </w:rPr>
-              <w:t>The Before, During, and After are one lesson on one concept, a single arc rather than three separate activities.</w:t>
+              <w:t>5</w:t>
+            </w:r>
+          </w:p>
+        </w:tc>
+        <w:tc>
+          <w:tcPr>
+            <w:tcW w:type="dxa" w:w="6912"/>
+          </w:tcPr>
+          <w:p>
+            <w:pPr>
+              <w:spacing w:after="0" w:line="240" w:lineRule="auto"/>
+            </w:pPr>
+            <w:r/>
+            <w:r>
+              <w:rPr>
+                <w:b w:val="0"/>
+                <w:color w:val="1F2933"/>
+                <w:sz w:val="19"/>
+              </w:rPr>
+              <w:t>A routine on the same math as your task that shows students’ entry thinking and does not give away the task’s key step.</w:t>
             </w:r>
           </w:p>
         </w:tc>
@@ -1090,69 +423,58 @@
       <w:tr>
         <w:tc>
           <w:tcPr>
-            <w:tcW w:w="1824" w:type="dxa"/>
-            <w:tcBorders>
-              <w:top w:val="single" w:sz="4" w:space="0" w:color="auto"/>
-              <w:left w:val="single" w:sz="4" w:space="0" w:color="auto"/>
-              <w:bottom w:val="single" w:sz="4" w:space="0" w:color="auto"/>
-              <w:right w:val="single" w:sz="4" w:space="0" w:color="auto"/>
-            </w:tcBorders>
-            <w:tcMar>
-              <w:top w:w="0" w:type="dxa"/>
-              <w:left w:w="108" w:type="dxa"/>
-              <w:bottom w:w="0" w:type="dxa"/>
-              <w:right w:w="108" w:type="dxa"/>
-            </w:tcMar>
+            <w:tcW w:type="dxa" w:w="2232"/>
           </w:tcPr>
           <w:p>
             <w:pPr>
-              <w:spacing w:line="240" w:lineRule="auto"/>
-              <w:jc w:val="start"/>
+              <w:spacing w:after="0" w:line="240" w:lineRule="auto"/>
             </w:pPr>
+            <w:r/>
             <w:r>
               <w:rPr>
-                <w:rFonts w:ascii="Calibri" w:hAnsi="Calibri" w:eastAsia="ＭＳ 明朝" w:cs="Calibri"/>
                 <w:b/>
-                <w:bCs/>
                 <w:color w:val="1F2933"/>
-                <w:kern w:val="0"/>
-                <w:sz w:val="22"/>
-                <w:szCs w:val="22"/>
+                <w:sz w:val="19"/>
               </w:rPr>
-              <w:t>An After that captures thinking (5)</w:t>
+              <w:t>During</w:t>
             </w:r>
           </w:p>
         </w:tc>
         <w:tc>
           <w:tcPr>
-            <w:tcW w:w="7824" w:type="dxa"/>
-            <w:tcBorders>
-              <w:top w:val="single" w:sz="4" w:space="0" w:color="auto"/>
-              <w:left w:val="single" w:sz="4" w:space="0" w:color="auto"/>
-              <w:bottom w:val="single" w:sz="4" w:space="0" w:color="auto"/>
-              <w:right w:val="single" w:sz="4" w:space="0" w:color="auto"/>
-            </w:tcBorders>
-            <w:tcMar>
-              <w:top w:w="0" w:type="dxa"/>
-              <w:left w:w="108" w:type="dxa"/>
-              <w:bottom w:w="0" w:type="dxa"/>
-              <w:right w:w="108" w:type="dxa"/>
-            </w:tcMar>
+            <w:tcW w:type="dxa" w:w="792"/>
           </w:tcPr>
           <w:p>
             <w:pPr>
-              <w:spacing w:line="240" w:lineRule="auto"/>
-              <w:jc w:val="start"/>
+              <w:spacing w:after="0" w:line="240" w:lineRule="auto"/>
             </w:pPr>
+            <w:r/>
             <w:r>
               <w:rPr>
-                <w:rFonts w:ascii="Calibri" w:hAnsi="Calibri" w:eastAsia="ＭＳ 明朝" w:cs="Calibri"/>
+                <w:b w:val="0"/>
                 <w:color w:val="1F2933"/>
-                <w:kern w:val="0"/>
-                <w:sz w:val="22"/>
-                <w:szCs w:val="22"/>
+                <w:sz w:val="19"/>
               </w:rPr>
-              <w:t>The After collects student work you could genuinely study in relation to your question, not a quick right-or-wrong check, and the Assessment section says what you will look for in it.</w:t>
+              <w:t>5</w:t>
+            </w:r>
+          </w:p>
+        </w:tc>
+        <w:tc>
+          <w:tcPr>
+            <w:tcW w:type="dxa" w:w="6912"/>
+          </w:tcPr>
+          <w:p>
+            <w:pPr>
+              <w:spacing w:after="0" w:line="240" w:lineRule="auto"/>
+            </w:pPr>
+            <w:r/>
+            <w:r>
+              <w:rPr>
+                <w:b w:val="0"/>
+                <w:color w:val="1F2933"/>
+                <w:sz w:val="19"/>
+              </w:rPr>
+              <w:t>A rich task with clear procedures, key questions, and anticipated student responses, including likely misconceptions.</w:t>
             </w:r>
           </w:p>
         </w:tc>
@@ -1160,69 +482,58 @@
       <w:tr>
         <w:tc>
           <w:tcPr>
-            <w:tcW w:w="1824" w:type="dxa"/>
-            <w:tcBorders>
-              <w:top w:val="single" w:sz="4" w:space="0" w:color="auto"/>
-              <w:left w:val="single" w:sz="4" w:space="0" w:color="auto"/>
-              <w:bottom w:val="single" w:sz="4" w:space="0" w:color="auto"/>
-              <w:right w:val="single" w:sz="4" w:space="0" w:color="auto"/>
-            </w:tcBorders>
-            <w:tcMar>
-              <w:top w:w="0" w:type="dxa"/>
-              <w:left w:w="108" w:type="dxa"/>
-              <w:bottom w:w="0" w:type="dxa"/>
-              <w:right w:w="108" w:type="dxa"/>
-            </w:tcMar>
+            <w:tcW w:type="dxa" w:w="2232"/>
           </w:tcPr>
           <w:p>
             <w:pPr>
-              <w:spacing w:line="240" w:lineRule="auto"/>
-              <w:jc w:val="start"/>
+              <w:spacing w:after="0" w:line="240" w:lineRule="auto"/>
             </w:pPr>
+            <w:r/>
             <w:r>
               <w:rPr>
-                <w:rFonts w:ascii="Calibri" w:hAnsi="Calibri" w:eastAsia="ＭＳ 明朝" w:cs="Calibri"/>
                 <w:b/>
-                <w:bCs/>
                 <w:color w:val="1F2933"/>
-                <w:kern w:val="0"/>
-                <w:sz w:val="22"/>
-                <w:szCs w:val="22"/>
+                <w:sz w:val="19"/>
               </w:rPr>
-              <w:t>A plan pointed at your question (5)</w:t>
+              <w:t>After</w:t>
             </w:r>
           </w:p>
         </w:tc>
         <w:tc>
           <w:tcPr>
-            <w:tcW w:w="7824" w:type="dxa"/>
-            <w:tcBorders>
-              <w:top w:val="single" w:sz="4" w:space="0" w:color="auto"/>
-              <w:left w:val="single" w:sz="4" w:space="0" w:color="auto"/>
-              <w:bottom w:val="single" w:sz="4" w:space="0" w:color="auto"/>
-              <w:right w:val="single" w:sz="4" w:space="0" w:color="auto"/>
-            </w:tcBorders>
-            <w:tcMar>
-              <w:top w:w="0" w:type="dxa"/>
-              <w:left w:w="108" w:type="dxa"/>
-              <w:bottom w:w="0" w:type="dxa"/>
-              <w:right w:w="108" w:type="dxa"/>
-            </w:tcMar>
+            <w:tcW w:type="dxa" w:w="792"/>
           </w:tcPr>
           <w:p>
             <w:pPr>
-              <w:spacing w:line="240" w:lineRule="auto"/>
-              <w:jc w:val="start"/>
+              <w:spacing w:after="0" w:line="240" w:lineRule="auto"/>
             </w:pPr>
+            <w:r/>
             <w:r>
               <w:rPr>
-                <w:rFonts w:ascii="Calibri" w:hAnsi="Calibri" w:eastAsia="ＭＳ 明朝" w:cs="Calibri"/>
+                <w:b w:val="0"/>
                 <w:color w:val="1F2933"/>
-                <w:kern w:val="0"/>
-                <w:sz w:val="22"/>
-                <w:szCs w:val="22"/>
+                <w:sz w:val="19"/>
               </w:rPr>
-              <w:t>Run start to finish, the lesson would surface something about how students understand the concept. The parts point at the question.</w:t>
+              <w:t>5</w:t>
+            </w:r>
+          </w:p>
+        </w:tc>
+        <w:tc>
+          <w:tcPr>
+            <w:tcW w:type="dxa" w:w="6912"/>
+          </w:tcPr>
+          <w:p>
+            <w:pPr>
+              <w:spacing w:after="0" w:line="240" w:lineRule="auto"/>
+            </w:pPr>
+            <w:r/>
+            <w:r>
+              <w:rPr>
+                <w:b w:val="0"/>
+                <w:color w:val="1F2933"/>
+                <w:sz w:val="19"/>
+              </w:rPr>
+              <w:t>Collects student work you could study against your question. An exit slip has three or more Student Questions, each tied to your research question.</w:t>
             </w:r>
           </w:p>
         </w:tc>
@@ -1230,69 +541,58 @@
       <w:tr>
         <w:tc>
           <w:tcPr>
-            <w:tcW w:w="1824" w:type="dxa"/>
-            <w:tcBorders>
-              <w:top w:val="single" w:sz="4" w:space="0" w:color="auto"/>
-              <w:left w:val="single" w:sz="4" w:space="0" w:color="auto"/>
-              <w:bottom w:val="single" w:sz="4" w:space="0" w:color="auto"/>
-              <w:right w:val="single" w:sz="4" w:space="0" w:color="auto"/>
-            </w:tcBorders>
-            <w:tcMar>
-              <w:top w:w="0" w:type="dxa"/>
-              <w:left w:w="108" w:type="dxa"/>
-              <w:bottom w:w="0" w:type="dxa"/>
-              <w:right w:w="108" w:type="dxa"/>
-            </w:tcMar>
+            <w:tcW w:type="dxa" w:w="2232"/>
           </w:tcPr>
           <w:p>
             <w:pPr>
-              <w:spacing w:line="240" w:lineRule="auto"/>
-              <w:jc w:val="start"/>
+              <w:spacing w:after="0" w:line="240" w:lineRule="auto"/>
             </w:pPr>
+            <w:r/>
             <w:r>
               <w:rPr>
-                <w:rFonts w:ascii="Calibri" w:hAnsi="Calibri" w:eastAsia="ＭＳ 明朝" w:cs="Calibri"/>
                 <w:b/>
-                <w:bCs/>
                 <w:color w:val="1F2933"/>
-                <w:kern w:val="0"/>
-                <w:sz w:val="22"/>
-                <w:szCs w:val="22"/>
+                <w:sz w:val="19"/>
               </w:rPr>
-              <w:t>A Before that opens the door (5)</w:t>
+              <w:t>Assessment</w:t>
             </w:r>
           </w:p>
         </w:tc>
         <w:tc>
           <w:tcPr>
-            <w:tcW w:w="7824" w:type="dxa"/>
-            <w:tcBorders>
-              <w:top w:val="single" w:sz="4" w:space="0" w:color="auto"/>
-              <w:left w:val="single" w:sz="4" w:space="0" w:color="auto"/>
-              <w:bottom w:val="single" w:sz="4" w:space="0" w:color="auto"/>
-              <w:right w:val="single" w:sz="4" w:space="0" w:color="auto"/>
-            </w:tcBorders>
-            <w:tcMar>
-              <w:top w:w="0" w:type="dxa"/>
-              <w:left w:w="108" w:type="dxa"/>
-              <w:bottom w:w="0" w:type="dxa"/>
-              <w:right w:w="108" w:type="dxa"/>
-            </w:tcMar>
+            <w:tcW w:type="dxa" w:w="792"/>
           </w:tcPr>
           <w:p>
             <w:pPr>
-              <w:spacing w:line="240" w:lineRule="auto"/>
-              <w:jc w:val="start"/>
+              <w:spacing w:after="0" w:line="240" w:lineRule="auto"/>
             </w:pPr>
+            <w:r/>
             <w:r>
               <w:rPr>
-                <w:rFonts w:ascii="Calibri" w:hAnsi="Calibri" w:eastAsia="ＭＳ 明朝" w:cs="Calibri"/>
+                <w:b w:val="0"/>
                 <w:color w:val="1F2933"/>
-                <w:kern w:val="0"/>
-                <w:sz w:val="22"/>
-                <w:szCs w:val="22"/>
+                <w:sz w:val="19"/>
               </w:rPr>
-              <w:t>The warm-up primes the thinking without handing over the strategy, representation, or procedure the task is meant to reveal.</w:t>
+              <w:t>3</w:t>
+            </w:r>
+          </w:p>
+        </w:tc>
+        <w:tc>
+          <w:tcPr>
+            <w:tcW w:type="dxa" w:w="6912"/>
+          </w:tcPr>
+          <w:p>
+            <w:pPr>
+              <w:spacing w:after="0" w:line="240" w:lineRule="auto"/>
+            </w:pPr>
+            <w:r/>
+            <w:r>
+              <w:rPr>
+                <w:b w:val="0"/>
+                <w:color w:val="1F2933"/>
+                <w:sz w:val="19"/>
+              </w:rPr>
+              <w:t>Names what you will look for in the work from the During and the After, and what would not count as evidence.</w:t>
             </w:r>
           </w:p>
         </w:tc>
@@ -1300,240 +600,187 @@
       <w:tr>
         <w:tc>
           <w:tcPr>
-            <w:tcW w:w="1824" w:type="dxa"/>
-            <w:tcBorders>
-              <w:top w:val="single" w:sz="4" w:space="0" w:color="auto"/>
-              <w:left w:val="single" w:sz="4" w:space="0" w:color="auto"/>
-              <w:bottom w:val="single" w:sz="4" w:space="0" w:color="auto"/>
-              <w:right w:val="single" w:sz="4" w:space="0" w:color="auto"/>
-            </w:tcBorders>
-            <w:tcMar>
-              <w:top w:w="0" w:type="dxa"/>
-              <w:left w:w="108" w:type="dxa"/>
-              <w:bottom w:w="0" w:type="dxa"/>
-              <w:right w:w="108" w:type="dxa"/>
-            </w:tcMar>
+            <w:tcW w:type="dxa" w:w="2232"/>
           </w:tcPr>
           <w:p>
             <w:pPr>
-              <w:spacing w:line="240" w:lineRule="auto"/>
-              <w:jc w:val="start"/>
+              <w:spacing w:after="0" w:line="240" w:lineRule="auto"/>
             </w:pPr>
+            <w:r/>
             <w:r>
               <w:rPr>
-                <w:rFonts w:ascii="Calibri" w:hAnsi="Calibri" w:eastAsia="ＭＳ 明朝" w:cs="Calibri"/>
                 <w:b/>
-                <w:bCs/>
                 <w:color w:val="1F2933"/>
-                <w:kern w:val="0"/>
-                <w:sz w:val="22"/>
-                <w:szCs w:val="22"/>
+                <w:sz w:val="19"/>
               </w:rPr>
-              <w:t>Reasoning from two reads (5)</w:t>
+              <w:t>One lesson aimed at the question</w:t>
             </w:r>
           </w:p>
         </w:tc>
         <w:tc>
           <w:tcPr>
-            <w:tcW w:w="7824" w:type="dxa"/>
-            <w:tcBorders>
-              <w:top w:val="single" w:sz="4" w:space="0" w:color="auto"/>
-              <w:left w:val="single" w:sz="4" w:space="0" w:color="auto"/>
-              <w:bottom w:val="single" w:sz="4" w:space="0" w:color="auto"/>
-              <w:right w:val="single" w:sz="4" w:space="0" w:color="auto"/>
-            </w:tcBorders>
-            <w:tcMar>
-              <w:top w:w="0" w:type="dxa"/>
-              <w:left w:w="108" w:type="dxa"/>
-              <w:bottom w:w="0" w:type="dxa"/>
-              <w:right w:w="108" w:type="dxa"/>
-            </w:tcMar>
+            <w:tcW w:type="dxa" w:w="792"/>
           </w:tcPr>
           <w:p>
             <w:pPr>
-              <w:spacing w:line="240" w:lineRule="auto"/>
-              <w:jc w:val="start"/>
+              <w:spacing w:after="0" w:line="240" w:lineRule="auto"/>
             </w:pPr>
+            <w:r/>
             <w:r>
               <w:rPr>
-                <w:rFonts w:ascii="Calibri" w:hAnsi="Calibri" w:eastAsia="ＭＳ 明朝" w:cs="Calibri"/>
+                <w:b w:val="0"/>
                 <w:color w:val="1F2933"/>
-                <w:kern w:val="0"/>
-                <w:sz w:val="22"/>
-                <w:szCs w:val="22"/>
+                <w:sz w:val="19"/>
               </w:rPr>
-              <w:t>The reflection reasons clearly about how the group’s review and the genAI planning partner’s reads shaped the After: what changed, what was set aside, and why.</w:t>
+              <w:t>4</w:t>
+            </w:r>
+          </w:p>
+        </w:tc>
+        <w:tc>
+          <w:tcPr>
+            <w:tcW w:type="dxa" w:w="6912"/>
+          </w:tcPr>
+          <w:p>
+            <w:pPr>
+              <w:spacing w:after="0" w:line="240" w:lineRule="auto"/>
+            </w:pPr>
+            <w:r/>
+            <w:r>
+              <w:rPr>
+                <w:b w:val="0"/>
+                <w:color w:val="1F2933"/>
+                <w:sz w:val="19"/>
+              </w:rPr>
+              <w:t>The Before, During, and After are one lesson on one concept, match your standards, and together point at your research question.</w:t>
+            </w:r>
+          </w:p>
+        </w:tc>
+      </w:tr>
+      <w:tr>
+        <w:tc>
+          <w:tcPr>
+            <w:tcW w:type="dxa" w:w="2232"/>
+          </w:tcPr>
+          <w:p>
+            <w:pPr>
+              <w:spacing w:after="0" w:line="240" w:lineRule="auto"/>
+            </w:pPr>
+            <w:r/>
+            <w:r>
+              <w:rPr>
+                <w:b/>
+                <w:color w:val="1F2933"/>
+                <w:sz w:val="19"/>
+              </w:rPr>
+              <w:t>Reflection on feedback</w:t>
+            </w:r>
+          </w:p>
+        </w:tc>
+        <w:tc>
+          <w:tcPr>
+            <w:tcW w:type="dxa" w:w="792"/>
+          </w:tcPr>
+          <w:p>
+            <w:pPr>
+              <w:spacing w:after="0" w:line="240" w:lineRule="auto"/>
+            </w:pPr>
+            <w:r/>
+            <w:r>
+              <w:rPr>
+                <w:b w:val="0"/>
+                <w:color w:val="1F2933"/>
+                <w:sz w:val="19"/>
+              </w:rPr>
+              <w:t>3</w:t>
+            </w:r>
+          </w:p>
+        </w:tc>
+        <w:tc>
+          <w:tcPr>
+            <w:tcW w:type="dxa" w:w="6912"/>
+          </w:tcPr>
+          <w:p>
+            <w:pPr>
+              <w:spacing w:after="0" w:line="240" w:lineRule="auto"/>
+            </w:pPr>
+            <w:r/>
+            <w:r>
+              <w:rPr>
+                <w:b w:val="0"/>
+                <w:color w:val="1F2933"/>
+                <w:sz w:val="19"/>
+              </w:rPr>
+              <w:t>One paragraph, specific to your After: what changed from your early drafts, what you set aside, and why. We are grading the judgment you brought to the feedback, not proof that you received it.</w:t>
+            </w:r>
+          </w:p>
+        </w:tc>
+      </w:tr>
+      <w:tr>
+        <w:tc>
+          <w:tcPr>
+            <w:tcW w:type="dxa" w:w="2232"/>
+            <w:shd w:val="clear" w:color="auto" w:fill="E8EEF6"/>
+          </w:tcPr>
+          <w:p>
+            <w:pPr>
+              <w:spacing w:after="0" w:line="240" w:lineRule="auto"/>
+            </w:pPr>
+            <w:r/>
+            <w:r>
+              <w:rPr>
+                <w:b/>
+                <w:color w:val="1F2933"/>
+                <w:sz w:val="19"/>
+              </w:rPr>
+              <w:t>Total</w:t>
+            </w:r>
+          </w:p>
+        </w:tc>
+        <w:tc>
+          <w:tcPr>
+            <w:tcW w:type="dxa" w:w="792"/>
+            <w:shd w:val="clear" w:color="auto" w:fill="E8EEF6"/>
+          </w:tcPr>
+          <w:p>
+            <w:pPr>
+              <w:spacing w:after="0" w:line="240" w:lineRule="auto"/>
+            </w:pPr>
+            <w:r/>
+            <w:r>
+              <w:rPr>
+                <w:b/>
+                <w:color w:val="1F2933"/>
+                <w:sz w:val="19"/>
+              </w:rPr>
+              <w:t>25</w:t>
+            </w:r>
+          </w:p>
+        </w:tc>
+        <w:tc>
+          <w:tcPr>
+            <w:tcW w:type="dxa" w:w="6912"/>
+            <w:shd w:val="clear" w:color="auto" w:fill="E8EEF6"/>
+          </w:tcPr>
+          <w:p>
+            <w:pPr>
+              <w:spacing w:after="0" w:line="240" w:lineRule="auto"/>
+            </w:pPr>
+            <w:r/>
+            <w:r>
+              <w:rPr>
+                <w:b w:val="0"/>
+                <w:color w:val="1F2933"/>
+                <w:sz w:val="19"/>
+              </w:rPr>
             </w:r>
           </w:p>
         </w:tc>
       </w:tr>
     </w:tbl>
-    <w:p>
-      <w:pPr>
-        <w:spacing w:before="0" w:after="160" w:line="276" w:lineRule="auto"/>
-        <w:jc w:val="start"/>
-      </w:pPr>
-      <w:r>
-        <w:rPr>
-          <w:sz w:val="22"/>
-        </w:rPr>
-      </w:r>
-    </w:p>
-    <w:p>
-      <w:pPr>
-        <w:spacing w:before="320" w:after="120" w:line="276" w:lineRule="auto"/>
-        <w:jc w:val="start"/>
-      </w:pPr>
-      <w:r>
-        <w:rPr>
-          <w:rFonts w:ascii="Calibri" w:hAnsi="Calibri" w:eastAsia="ＭＳ 明朝" w:cs="Calibri"/>
-          <w:b/>
-          <w:bCs/>
-          <w:color w:val="0070C0"/>
-          <w:kern w:val="0"/>
-          <w:sz w:val="24"/>
-          <w:szCs w:val="24"/>
-        </w:rPr>
-        <w:t>What the genAI Planning Partner Checks</w:t>
-      </w:r>
-    </w:p>
-    <w:p>
-      <w:pPr>
-        <w:spacing w:before="0" w:after="160" w:line="276" w:lineRule="auto"/>
-        <w:jc w:val="start"/>
-      </w:pPr>
-      <w:r>
-        <w:rPr>
-          <w:rFonts w:ascii="Calibri" w:hAnsi="Calibri" w:eastAsia="ＭＳ 明朝" w:cs="Calibri"/>
-          <w:color w:val="1F2933"/>
-          <w:kern w:val="0"/>
-          <w:sz w:val="22"/>
-          <w:szCs w:val="22"/>
-        </w:rPr>
-        <w:t>Press Check this on each pane. Nothing to paste — the BDA Planner holds your whole plan and your question. It does this with them:</w:t>
-      </w:r>
-    </w:p>
-    <w:p>
-      <w:pPr>
-        <w:spacing w:before="0" w:after="160" w:line="276" w:lineRule="auto"/>
-        <w:jc w:val="start"/>
-      </w:pPr>
-      <w:r>
-        <w:rPr>
-          <w:rFonts w:ascii="Calibri" w:hAnsi="Calibri" w:eastAsia="ＭＳ 明朝" w:cs="Calibri"/>
-          <w:color w:val="1F2933"/>
-          <w:kern w:val="0"/>
-          <w:sz w:val="22"/>
-          <w:szCs w:val="22"/>
-        </w:rPr>
-        <w:t>It acts as a critical friend checking a lesson designed to investigate a research question about how students understand a mathematical concept. It will not redesign it — it tests the one you built, against the question you wrote in the BDA Planner, across its three parts: the Before (a warm-up routine), the During (a rich task), and the After (how you capture students’ thinking). It answers plainly:</w:t>
-      </w:r>
-    </w:p>
-    <w:p>
-      <w:pPr>
-        <w:spacing w:before="0" w:after="80" w:line="276" w:lineRule="auto"/>
-        <w:ind w:left="360" w:hanging="360"/>
-        <w:jc w:val="start"/>
-      </w:pPr>
-      <w:r>
-        <w:rPr>
-          <w:rFonts w:ascii="Calibri" w:hAnsi="Calibri" w:eastAsia="ＭＳ 明朝" w:cs="Calibri"/>
-          <w:color w:val="1F2933"/>
-          <w:kern w:val="0"/>
-          <w:sz w:val="22"/>
-          <w:szCs w:val="22"/>
-        </w:rPr>
-        <w:t>1. Reading the whole plan against your question: if you taught this, would students’ responses give you insight into it? Where would it, and where would it fall short?</w:t>
-      </w:r>
-    </w:p>
-    <w:p>
-      <w:pPr>
-        <w:spacing w:before="0" w:after="80" w:line="276" w:lineRule="auto"/>
-        <w:ind w:left="360" w:hanging="360"/>
-        <w:jc w:val="start"/>
-      </w:pPr>
-      <w:r>
-        <w:rPr>
-          <w:rFonts w:ascii="Calibri" w:hAnsi="Calibri" w:eastAsia="ＭＳ 明朝" w:cs="Calibri"/>
-          <w:color w:val="1F2933"/>
-          <w:kern w:val="0"/>
-          <w:sz w:val="22"/>
-          <w:szCs w:val="22"/>
-        </w:rPr>
-        <w:t>2. The After is where you capture evidence. Would what you collect there be something you could study in relation to your question, or is it too thin? Have you said what you would look for in it?</w:t>
-      </w:r>
-    </w:p>
-    <w:p>
-      <w:pPr>
-        <w:spacing w:before="0" w:after="80" w:line="276" w:lineRule="auto"/>
-        <w:ind w:left="360" w:hanging="360"/>
-        <w:jc w:val="start"/>
-      </w:pPr>
-      <w:r>
-        <w:rPr>
-          <w:rFonts w:ascii="Calibri" w:hAnsi="Calibri" w:eastAsia="ＭＳ 明朝" w:cs="Calibri"/>
-          <w:color w:val="1F2933"/>
-          <w:kern w:val="0"/>
-          <w:sz w:val="22"/>
-          <w:szCs w:val="22"/>
-        </w:rPr>
-        <w:t>3. Where could a student get through the lesson without revealing their thinking?</w:t>
-      </w:r>
-    </w:p>
-    <w:p>
-      <w:pPr>
-        <w:spacing w:before="0" w:after="80" w:line="276" w:lineRule="auto"/>
-        <w:ind w:left="360" w:hanging="360"/>
-        <w:jc w:val="start"/>
-      </w:pPr>
-      <w:r>
-        <w:rPr>
-          <w:rFonts w:ascii="Calibri" w:hAnsi="Calibri" w:eastAsia="ＭＳ 明朝" w:cs="Calibri"/>
-          <w:color w:val="1F2933"/>
-          <w:kern w:val="0"/>
-          <w:sz w:val="22"/>
-          <w:szCs w:val="22"/>
-        </w:rPr>
-        <w:t>4. Does the Before give away the move the During is meant to reveal?</w:t>
-      </w:r>
-    </w:p>
-    <w:p>
-      <w:pPr>
-        <w:spacing w:before="0" w:after="80" w:line="276" w:lineRule="auto"/>
-        <w:ind w:left="360" w:hanging="360"/>
-        <w:jc w:val="start"/>
-      </w:pPr>
-      <w:r>
-        <w:rPr>
-          <w:rFonts w:ascii="Calibri" w:hAnsi="Calibri" w:eastAsia="ＭＳ 明朝" w:cs="Calibri"/>
-          <w:color w:val="1F2933"/>
-          <w:kern w:val="0"/>
-          <w:sz w:val="22"/>
-          <w:szCs w:val="22"/>
-        </w:rPr>
-        <w:t>5. What one or two changes would make this a sharper instrument for your question?</w:t>
-      </w:r>
-    </w:p>
-    <w:p>
-      <w:pPr>
-        <w:spacing w:before="0" w:after="160" w:line="276" w:lineRule="auto"/>
-        <w:jc w:val="start"/>
-      </w:pPr>
-      <w:r>
-        <w:rPr>
-          <w:rFonts w:ascii="Calibri" w:hAnsi="Calibri" w:eastAsia="ＭＳ 明朝" w:cs="Calibri"/>
-          <w:color w:val="1F2933"/>
-          <w:kern w:val="0"/>
-          <w:sz w:val="22"/>
-          <w:szCs w:val="22"/>
-        </w:rPr>
-        <w:t>If the plan would give you little insight into your question, it will say so plainly.</w:t>
-      </w:r>
-    </w:p>
     <w:sectPr>
       <w:type w:val="nextPage"/>
       <w:pgSz w:w="12240" w:h="15840"/>
-      <w:pgMar w:top="1008" w:right="1296" w:bottom="1008" w:left="1296" w:header="0" w:footer="0" w:gutter="0"/>
+      <w:pgMar w:top="864" w:right="1152" w:bottom="864" w:left="1152" w:header="0" w:footer="0" w:gutter="0"/>
       <w:docGrid w:type="default" w:linePitch="360" w:charSpace="0"/>
     </w:sectPr>
   </w:body>

</xml_diff>